<commit_message>
Revise manuscript prose in the style of Nguyen et al. and Voldsund et al. (Energy 2013)
Longer connected sentences, passive voice for methods, purpose statements at
the start of results sections, a framing paragraph for the discussion,
conclusions as prose, and capitalised case labels. All numbers and citations
are unchanged; abstract 248 words, main text 8,707 words.
</commit_message>
<xml_diff>
--- a/docs/paper/supplementary.docx
+++ b/docs/paper/supplementary.docx
@@ -213,7 +213,7 @@
         <w:pStyle w:val="FirstParagraph"/>
       </w:pPr>
       <w:r>
-        <w:t xml:space="preserve">Monthly emissions follow the wind. With fixed demand (case 2) they range</w:t>
+        <w:t xml:space="preserve">Monthly emissions follow the wind. With fixed demand (Case 2) they range</w:t>
       </w:r>
       <w:r>
         <w:t xml:space="preserve"> </w:t>
@@ -225,7 +225,7 @@
         <w:t xml:space="preserve"> </w:t>
       </w:r>
       <w:r>
-        <w:t xml:space="preserve">flexibility (case 2 − case 3) is present in every month (0.43–0.77 kt). It</w:t>
+        <w:t xml:space="preserve">flexibility (Case 2 − Case 3) is present in every month (0.43–0.77 kt). It</w:t>
       </w:r>
       <w:r>
         <w:t xml:space="preserve"> </w:t>
@@ -302,7 +302,7 @@
         <w:t xml:space="preserve"> </w:t>
       </w:r>
       <w:r>
-        <w:t xml:space="preserve">Monthly CO2 emissions for cases 1–4.</w:t>
+        <w:t xml:space="preserve">Monthly CO2 emissions for Cases 1–4.</w:t>
       </w:r>
     </w:p>
     <w:bookmarkEnd w:id="31"/>

</xml_diff>

<commit_message>
Economic indicators as two clear tables: wind farm abatement cost (Table 7) and break-even values (Table 8)
Generated by economics.paper_tables; the fuel value per tonne is now given
as a positive number instead of a negative abatement cost. Weather-year table
renumbered to Table 9. Table columns sized by their data; the word count
excludes table captions, as it already did for figure captions.
</commit_message>
<xml_diff>
--- a/docs/paper/supplementary.docx
+++ b/docs/paper/supplementary.docx
@@ -420,10 +420,10 @@
         </w:tblBorders>
       </w:tblPr>
       <w:tblGrid>
-        <w:gridCol w:w="2360"/>
-        <w:gridCol w:w="1656"/>
-        <w:gridCol w:w="1283"/>
-        <w:gridCol w:w="4058"/>
+        <w:gridCol w:w="2340"/>
+        <w:gridCol w:w="2340"/>
+        <w:gridCol w:w="2340"/>
+        <w:gridCol w:w="2340"/>
       </w:tblGrid>
       <w:tr>
         <w:trPr>
@@ -432,7 +432,7 @@
         </w:trPr>
         <w:tc>
           <w:tcPr>
-            <w:tcW w:type="dxa" w:w="2360"/>
+            <w:tcW w:type="dxa" w:w="2340"/>
             <w:tcBorders>
               <w:bottom w:val="single" w:sz="4" w:space="0" w:color="000000"/>
             </w:tcBorders>
@@ -454,7 +454,7 @@
         </w:tc>
         <w:tc>
           <w:tcPr>
-            <w:tcW w:type="dxa" w:w="1656"/>
+            <w:tcW w:type="dxa" w:w="2340"/>
             <w:tcBorders>
               <w:bottom w:val="single" w:sz="4" w:space="0" w:color="000000"/>
             </w:tcBorders>
@@ -476,7 +476,7 @@
         </w:tc>
         <w:tc>
           <w:tcPr>
-            <w:tcW w:type="dxa" w:w="1283"/>
+            <w:tcW w:type="dxa" w:w="2340"/>
             <w:tcBorders>
               <w:bottom w:val="single" w:sz="4" w:space="0" w:color="000000"/>
             </w:tcBorders>
@@ -498,7 +498,7 @@
         </w:tc>
         <w:tc>
           <w:tcPr>
-            <w:tcW w:type="dxa" w:w="4058"/>
+            <w:tcW w:type="dxa" w:w="2340"/>
             <w:tcBorders>
               <w:bottom w:val="single" w:sz="4" w:space="0" w:color="000000"/>
             </w:tcBorders>
@@ -522,7 +522,7 @@
       <w:tr>
         <w:tc>
           <w:tcPr>
-            <w:tcW w:type="dxa" w:w="2360"/>
+            <w:tcW w:type="dxa" w:w="2340"/>
           </w:tcPr>
           <w:p>
             <w:pPr>
@@ -540,7 +540,7 @@
         </w:tc>
         <w:tc>
           <w:tcPr>
-            <w:tcW w:type="dxa" w:w="1656"/>
+            <w:tcW w:type="dxa" w:w="2340"/>
           </w:tcPr>
           <w:p>
             <w:pPr>
@@ -558,7 +558,7 @@
         </w:tc>
         <w:tc>
           <w:tcPr>
-            <w:tcW w:type="dxa" w:w="1283"/>
+            <w:tcW w:type="dxa" w:w="2340"/>
           </w:tcPr>
           <w:p>
             <w:pPr>
@@ -576,7 +576,7 @@
         </w:tc>
         <w:tc>
           <w:tcPr>
-            <w:tcW w:type="dxa" w:w="4058"/>
+            <w:tcW w:type="dxa" w:w="2340"/>
           </w:tcPr>
           <w:p>
             <w:pPr>
@@ -596,7 +596,7 @@
       <w:tr>
         <w:tc>
           <w:tcPr>
-            <w:tcW w:type="dxa" w:w="2360"/>
+            <w:tcW w:type="dxa" w:w="2340"/>
           </w:tcPr>
           <w:p>
             <w:pPr>
@@ -614,7 +614,7 @@
         </w:tc>
         <w:tc>
           <w:tcPr>
-            <w:tcW w:type="dxa" w:w="1656"/>
+            <w:tcW w:type="dxa" w:w="2340"/>
           </w:tcPr>
           <w:p>
             <w:pPr>
@@ -632,7 +632,7 @@
         </w:tc>
         <w:tc>
           <w:tcPr>
-            <w:tcW w:type="dxa" w:w="1283"/>
+            <w:tcW w:type="dxa" w:w="2340"/>
           </w:tcPr>
           <w:p>
             <w:pPr>
@@ -650,7 +650,7 @@
         </w:tc>
         <w:tc>
           <w:tcPr>
-            <w:tcW w:type="dxa" w:w="4058"/>
+            <w:tcW w:type="dxa" w:w="2340"/>
           </w:tcPr>
           <w:p>
             <w:pPr>
@@ -670,7 +670,7 @@
       <w:tr>
         <w:tc>
           <w:tcPr>
-            <w:tcW w:type="dxa" w:w="2360"/>
+            <w:tcW w:type="dxa" w:w="2340"/>
           </w:tcPr>
           <w:p>
             <w:pPr>
@@ -688,7 +688,7 @@
         </w:tc>
         <w:tc>
           <w:tcPr>
-            <w:tcW w:type="dxa" w:w="1656"/>
+            <w:tcW w:type="dxa" w:w="2340"/>
           </w:tcPr>
           <w:p>
             <w:pPr>
@@ -706,7 +706,7 @@
         </w:tc>
         <w:tc>
           <w:tcPr>
-            <w:tcW w:type="dxa" w:w="1283"/>
+            <w:tcW w:type="dxa" w:w="2340"/>
           </w:tcPr>
           <w:p>
             <w:pPr>
@@ -724,7 +724,7 @@
         </w:tc>
         <w:tc>
           <w:tcPr>
-            <w:tcW w:type="dxa" w:w="4058"/>
+            <w:tcW w:type="dxa" w:w="2340"/>
           </w:tcPr>
           <w:p>
             <w:pPr>
@@ -744,7 +744,7 @@
       <w:tr>
         <w:tc>
           <w:tcPr>
-            <w:tcW w:type="dxa" w:w="2360"/>
+            <w:tcW w:type="dxa" w:w="2340"/>
           </w:tcPr>
           <w:p>
             <w:pPr>
@@ -762,7 +762,7 @@
         </w:tc>
         <w:tc>
           <w:tcPr>
-            <w:tcW w:type="dxa" w:w="1656"/>
+            <w:tcW w:type="dxa" w:w="2340"/>
           </w:tcPr>
           <w:p>
             <w:pPr>
@@ -780,7 +780,7 @@
         </w:tc>
         <w:tc>
           <w:tcPr>
-            <w:tcW w:type="dxa" w:w="1283"/>
+            <w:tcW w:type="dxa" w:w="2340"/>
           </w:tcPr>
           <w:p>
             <w:pPr>
@@ -798,7 +798,7 @@
         </w:tc>
         <w:tc>
           <w:tcPr>
-            <w:tcW w:type="dxa" w:w="4058"/>
+            <w:tcW w:type="dxa" w:w="2340"/>
           </w:tcPr>
           <w:p>
             <w:pPr>
@@ -818,7 +818,7 @@
       <w:tr>
         <w:tc>
           <w:tcPr>
-            <w:tcW w:type="dxa" w:w="2360"/>
+            <w:tcW w:type="dxa" w:w="2340"/>
           </w:tcPr>
           <w:p>
             <w:pPr>
@@ -836,7 +836,7 @@
         </w:tc>
         <w:tc>
           <w:tcPr>
-            <w:tcW w:type="dxa" w:w="1656"/>
+            <w:tcW w:type="dxa" w:w="2340"/>
           </w:tcPr>
           <w:p>
             <w:pPr>
@@ -854,7 +854,7 @@
         </w:tc>
         <w:tc>
           <w:tcPr>
-            <w:tcW w:type="dxa" w:w="1283"/>
+            <w:tcW w:type="dxa" w:w="2340"/>
           </w:tcPr>
           <w:p>
             <w:pPr>
@@ -872,7 +872,7 @@
         </w:tc>
         <w:tc>
           <w:tcPr>
-            <w:tcW w:type="dxa" w:w="4058"/>
+            <w:tcW w:type="dxa" w:w="2340"/>
           </w:tcPr>
           <w:p>
             <w:pPr>
@@ -892,7 +892,7 @@
       <w:tr>
         <w:tc>
           <w:tcPr>
-            <w:tcW w:type="dxa" w:w="2360"/>
+            <w:tcW w:type="dxa" w:w="2340"/>
           </w:tcPr>
           <w:p>
             <w:pPr>
@@ -910,7 +910,7 @@
         </w:tc>
         <w:tc>
           <w:tcPr>
-            <w:tcW w:type="dxa" w:w="1656"/>
+            <w:tcW w:type="dxa" w:w="2340"/>
           </w:tcPr>
           <w:p>
             <w:pPr>
@@ -928,7 +928,7 @@
         </w:tc>
         <w:tc>
           <w:tcPr>
-            <w:tcW w:type="dxa" w:w="1283"/>
+            <w:tcW w:type="dxa" w:w="2340"/>
           </w:tcPr>
           <w:p>
             <w:pPr>
@@ -946,7 +946,7 @@
         </w:tc>
         <w:tc>
           <w:tcPr>
-            <w:tcW w:type="dxa" w:w="4058"/>
+            <w:tcW w:type="dxa" w:w="2340"/>
           </w:tcPr>
           <w:p>
             <w:pPr>
@@ -966,7 +966,7 @@
       <w:tr>
         <w:tc>
           <w:tcPr>
-            <w:tcW w:type="dxa" w:w="2360"/>
+            <w:tcW w:type="dxa" w:w="2340"/>
           </w:tcPr>
           <w:p>
             <w:pPr>
@@ -984,7 +984,7 @@
         </w:tc>
         <w:tc>
           <w:tcPr>
-            <w:tcW w:type="dxa" w:w="1656"/>
+            <w:tcW w:type="dxa" w:w="2340"/>
           </w:tcPr>
           <w:p>
             <w:pPr>
@@ -1002,7 +1002,7 @@
         </w:tc>
         <w:tc>
           <w:tcPr>
-            <w:tcW w:type="dxa" w:w="1283"/>
+            <w:tcW w:type="dxa" w:w="2340"/>
           </w:tcPr>
           <w:p>
             <w:pPr>
@@ -1020,7 +1020,7 @@
         </w:tc>
         <w:tc>
           <w:tcPr>
-            <w:tcW w:type="dxa" w:w="4058"/>
+            <w:tcW w:type="dxa" w:w="2340"/>
           </w:tcPr>
           <w:p>
             <w:pPr>
@@ -1040,7 +1040,7 @@
       <w:tr>
         <w:tc>
           <w:tcPr>
-            <w:tcW w:type="dxa" w:w="2360"/>
+            <w:tcW w:type="dxa" w:w="2340"/>
           </w:tcPr>
           <w:p>
             <w:pPr>
@@ -1058,7 +1058,7 @@
         </w:tc>
         <w:tc>
           <w:tcPr>
-            <w:tcW w:type="dxa" w:w="1656"/>
+            <w:tcW w:type="dxa" w:w="2340"/>
           </w:tcPr>
           <w:p>
             <w:pPr>
@@ -1076,7 +1076,7 @@
         </w:tc>
         <w:tc>
           <w:tcPr>
-            <w:tcW w:type="dxa" w:w="1283"/>
+            <w:tcW w:type="dxa" w:w="2340"/>
           </w:tcPr>
           <w:p>
             <w:pPr>
@@ -1094,7 +1094,7 @@
         </w:tc>
         <w:tc>
           <w:tcPr>
-            <w:tcW w:type="dxa" w:w="4058"/>
+            <w:tcW w:type="dxa" w:w="2340"/>
           </w:tcPr>
           <w:p>
             <w:pPr>
@@ -1114,7 +1114,7 @@
       <w:tr>
         <w:tc>
           <w:tcPr>
-            <w:tcW w:type="dxa" w:w="2360"/>
+            <w:tcW w:type="dxa" w:w="2340"/>
           </w:tcPr>
           <w:p>
             <w:pPr>
@@ -1132,7 +1132,7 @@
         </w:tc>
         <w:tc>
           <w:tcPr>
-            <w:tcW w:type="dxa" w:w="1656"/>
+            <w:tcW w:type="dxa" w:w="2340"/>
           </w:tcPr>
           <w:p>
             <w:pPr>
@@ -1150,7 +1150,7 @@
         </w:tc>
         <w:tc>
           <w:tcPr>
-            <w:tcW w:type="dxa" w:w="1283"/>
+            <w:tcW w:type="dxa" w:w="2340"/>
           </w:tcPr>
           <w:p>
             <w:pPr>
@@ -1168,7 +1168,7 @@
         </w:tc>
         <w:tc>
           <w:tcPr>
-            <w:tcW w:type="dxa" w:w="4058"/>
+            <w:tcW w:type="dxa" w:w="2340"/>
           </w:tcPr>
           <w:p>
             <w:pPr>
@@ -1188,7 +1188,7 @@
       <w:tr>
         <w:tc>
           <w:tcPr>
-            <w:tcW w:type="dxa" w:w="2360"/>
+            <w:tcW w:type="dxa" w:w="2340"/>
           </w:tcPr>
           <w:p>
             <w:pPr>
@@ -1206,7 +1206,7 @@
         </w:tc>
         <w:tc>
           <w:tcPr>
-            <w:tcW w:type="dxa" w:w="1656"/>
+            <w:tcW w:type="dxa" w:w="2340"/>
           </w:tcPr>
           <w:p>
             <w:pPr>
@@ -1224,7 +1224,7 @@
         </w:tc>
         <w:tc>
           <w:tcPr>
-            <w:tcW w:type="dxa" w:w="1283"/>
+            <w:tcW w:type="dxa" w:w="2340"/>
           </w:tcPr>
           <w:p>
             <w:pPr>
@@ -1242,7 +1242,7 @@
         </w:tc>
         <w:tc>
           <w:tcPr>
-            <w:tcW w:type="dxa" w:w="4058"/>
+            <w:tcW w:type="dxa" w:w="2340"/>
           </w:tcPr>
           <w:p>
             <w:pPr>
@@ -1262,7 +1262,7 @@
       <w:tr>
         <w:tc>
           <w:tcPr>
-            <w:tcW w:type="dxa" w:w="2360"/>
+            <w:tcW w:type="dxa" w:w="2340"/>
           </w:tcPr>
           <w:p>
             <w:pPr>
@@ -1280,7 +1280,7 @@
         </w:tc>
         <w:tc>
           <w:tcPr>
-            <w:tcW w:type="dxa" w:w="1656"/>
+            <w:tcW w:type="dxa" w:w="2340"/>
           </w:tcPr>
           <w:p>
             <w:pPr>
@@ -1298,7 +1298,7 @@
         </w:tc>
         <w:tc>
           <w:tcPr>
-            <w:tcW w:type="dxa" w:w="1283"/>
+            <w:tcW w:type="dxa" w:w="2340"/>
           </w:tcPr>
           <w:p>
             <w:pPr>
@@ -1316,7 +1316,7 @@
         </w:tc>
         <w:tc>
           <w:tcPr>
-            <w:tcW w:type="dxa" w:w="4058"/>
+            <w:tcW w:type="dxa" w:w="2340"/>
           </w:tcPr>
           <w:p>
             <w:pPr>
@@ -1336,7 +1336,7 @@
       <w:tr>
         <w:tc>
           <w:tcPr>
-            <w:tcW w:type="dxa" w:w="2360"/>
+            <w:tcW w:type="dxa" w:w="2340"/>
           </w:tcPr>
           <w:p>
             <w:pPr>
@@ -1354,7 +1354,7 @@
         </w:tc>
         <w:tc>
           <w:tcPr>
-            <w:tcW w:type="dxa" w:w="1656"/>
+            <w:tcW w:type="dxa" w:w="2340"/>
           </w:tcPr>
           <w:p>
             <w:pPr>
@@ -1372,7 +1372,7 @@
         </w:tc>
         <w:tc>
           <w:tcPr>
-            <w:tcW w:type="dxa" w:w="1283"/>
+            <w:tcW w:type="dxa" w:w="2340"/>
           </w:tcPr>
           <w:p>
             <w:pPr>
@@ -1390,7 +1390,7 @@
         </w:tc>
         <w:tc>
           <w:tcPr>
-            <w:tcW w:type="dxa" w:w="4058"/>
+            <w:tcW w:type="dxa" w:w="2340"/>
           </w:tcPr>
           <w:p>
             <w:pPr>
@@ -1410,7 +1410,7 @@
       <w:tr>
         <w:tc>
           <w:tcPr>
-            <w:tcW w:type="dxa" w:w="2360"/>
+            <w:tcW w:type="dxa" w:w="2340"/>
           </w:tcPr>
           <w:p>
             <w:pPr>
@@ -1428,7 +1428,7 @@
         </w:tc>
         <w:tc>
           <w:tcPr>
-            <w:tcW w:type="dxa" w:w="1656"/>
+            <w:tcW w:type="dxa" w:w="2340"/>
           </w:tcPr>
           <w:p>
             <w:pPr>
@@ -1446,7 +1446,7 @@
         </w:tc>
         <w:tc>
           <w:tcPr>
-            <w:tcW w:type="dxa" w:w="1283"/>
+            <w:tcW w:type="dxa" w:w="2340"/>
           </w:tcPr>
           <w:p>
             <w:pPr>
@@ -1464,7 +1464,7 @@
         </w:tc>
         <w:tc>
           <w:tcPr>
-            <w:tcW w:type="dxa" w:w="4058"/>
+            <w:tcW w:type="dxa" w:w="2340"/>
           </w:tcPr>
           <w:p>
             <w:pPr>
@@ -1484,7 +1484,7 @@
       <w:tr>
         <w:tc>
           <w:tcPr>
-            <w:tcW w:type="dxa" w:w="2360"/>
+            <w:tcW w:type="dxa" w:w="2340"/>
           </w:tcPr>
           <w:p>
             <w:pPr>
@@ -1502,7 +1502,7 @@
         </w:tc>
         <w:tc>
           <w:tcPr>
-            <w:tcW w:type="dxa" w:w="1656"/>
+            <w:tcW w:type="dxa" w:w="2340"/>
           </w:tcPr>
           <w:p>
             <w:pPr>
@@ -1520,7 +1520,7 @@
         </w:tc>
         <w:tc>
           <w:tcPr>
-            <w:tcW w:type="dxa" w:w="1283"/>
+            <w:tcW w:type="dxa" w:w="2340"/>
           </w:tcPr>
           <w:p>
             <w:pPr>
@@ -1538,7 +1538,7 @@
         </w:tc>
         <w:tc>
           <w:tcPr>
-            <w:tcW w:type="dxa" w:w="4058"/>
+            <w:tcW w:type="dxa" w:w="2340"/>
           </w:tcPr>
           <w:p>
             <w:pPr>
@@ -1558,7 +1558,7 @@
       <w:tr>
         <w:tc>
           <w:tcPr>
-            <w:tcW w:type="dxa" w:w="2360"/>
+            <w:tcW w:type="dxa" w:w="2340"/>
           </w:tcPr>
           <w:p>
             <w:pPr>
@@ -1576,7 +1576,7 @@
         </w:tc>
         <w:tc>
           <w:tcPr>
-            <w:tcW w:type="dxa" w:w="1656"/>
+            <w:tcW w:type="dxa" w:w="2340"/>
           </w:tcPr>
           <w:p>
             <w:pPr>
@@ -1594,7 +1594,7 @@
         </w:tc>
         <w:tc>
           <w:tcPr>
-            <w:tcW w:type="dxa" w:w="1283"/>
+            <w:tcW w:type="dxa" w:w="2340"/>
           </w:tcPr>
           <w:p>
             <w:pPr>
@@ -1612,7 +1612,7 @@
         </w:tc>
         <w:tc>
           <w:tcPr>
-            <w:tcW w:type="dxa" w:w="4058"/>
+            <w:tcW w:type="dxa" w:w="2340"/>
           </w:tcPr>
           <w:p>
             <w:pPr>
@@ -1632,7 +1632,7 @@
       <w:tr>
         <w:tc>
           <w:tcPr>
-            <w:tcW w:type="dxa" w:w="2360"/>
+            <w:tcW w:type="dxa" w:w="2340"/>
           </w:tcPr>
           <w:p>
             <w:pPr>
@@ -1650,7 +1650,7 @@
         </w:tc>
         <w:tc>
           <w:tcPr>
-            <w:tcW w:type="dxa" w:w="1656"/>
+            <w:tcW w:type="dxa" w:w="2340"/>
           </w:tcPr>
           <w:p>
             <w:pPr>
@@ -1668,7 +1668,7 @@
         </w:tc>
         <w:tc>
           <w:tcPr>
-            <w:tcW w:type="dxa" w:w="1283"/>
+            <w:tcW w:type="dxa" w:w="2340"/>
           </w:tcPr>
           <w:p>
             <w:pPr>
@@ -1686,7 +1686,7 @@
         </w:tc>
         <w:tc>
           <w:tcPr>
-            <w:tcW w:type="dxa" w:w="4058"/>
+            <w:tcW w:type="dxa" w:w="2340"/>
           </w:tcPr>
           <w:p>
             <w:pPr>
@@ -1706,7 +1706,7 @@
       <w:tr>
         <w:tc>
           <w:tcPr>
-            <w:tcW w:type="dxa" w:w="2360"/>
+            <w:tcW w:type="dxa" w:w="2340"/>
           </w:tcPr>
           <w:p>
             <w:pPr>
@@ -1724,7 +1724,7 @@
         </w:tc>
         <w:tc>
           <w:tcPr>
-            <w:tcW w:type="dxa" w:w="1656"/>
+            <w:tcW w:type="dxa" w:w="2340"/>
           </w:tcPr>
           <w:p>
             <w:pPr>
@@ -2006,7 +2006,7 @@
         </w:tc>
         <w:tc>
           <w:tcPr>
-            <w:tcW w:type="dxa" w:w="1283"/>
+            <w:tcW w:type="dxa" w:w="2340"/>
           </w:tcPr>
           <w:p>
             <w:pPr>
@@ -2024,7 +2024,7 @@
         </w:tc>
         <w:tc>
           <w:tcPr>
-            <w:tcW w:type="dxa" w:w="4058"/>
+            <w:tcW w:type="dxa" w:w="2340"/>
           </w:tcPr>
           <w:p>
             <w:pPr>
@@ -2044,7 +2044,7 @@
       <w:tr>
         <w:tc>
           <w:tcPr>
-            <w:tcW w:type="dxa" w:w="2360"/>
+            <w:tcW w:type="dxa" w:w="2340"/>
           </w:tcPr>
           <w:p>
             <w:pPr>
@@ -2062,7 +2062,7 @@
         </w:tc>
         <w:tc>
           <w:tcPr>
-            <w:tcW w:type="dxa" w:w="1656"/>
+            <w:tcW w:type="dxa" w:w="2340"/>
           </w:tcPr>
           <w:p>
             <w:pPr>
@@ -2080,7 +2080,7 @@
         </w:tc>
         <w:tc>
           <w:tcPr>
-            <w:tcW w:type="dxa" w:w="1283"/>
+            <w:tcW w:type="dxa" w:w="2340"/>
           </w:tcPr>
           <w:p>
             <w:pPr>
@@ -2098,7 +2098,7 @@
         </w:tc>
         <w:tc>
           <w:tcPr>
-            <w:tcW w:type="dxa" w:w="4058"/>
+            <w:tcW w:type="dxa" w:w="2340"/>
           </w:tcPr>
           <w:p>
             <w:pPr>
@@ -2118,7 +2118,7 @@
       <w:tr>
         <w:tc>
           <w:tcPr>
-            <w:tcW w:type="dxa" w:w="2360"/>
+            <w:tcW w:type="dxa" w:w="2340"/>
           </w:tcPr>
           <w:p>
             <w:pPr>
@@ -2136,7 +2136,7 @@
         </w:tc>
         <w:tc>
           <w:tcPr>
-            <w:tcW w:type="dxa" w:w="1656"/>
+            <w:tcW w:type="dxa" w:w="2340"/>
           </w:tcPr>
           <w:p>
             <w:pPr>
@@ -2154,7 +2154,7 @@
         </w:tc>
         <w:tc>
           <w:tcPr>
-            <w:tcW w:type="dxa" w:w="1283"/>
+            <w:tcW w:type="dxa" w:w="2340"/>
           </w:tcPr>
           <w:p>
             <w:pPr>
@@ -2172,7 +2172,7 @@
         </w:tc>
         <w:tc>
           <w:tcPr>
-            <w:tcW w:type="dxa" w:w="4058"/>
+            <w:tcW w:type="dxa" w:w="2340"/>
           </w:tcPr>
           <w:p>
             <w:pPr>
@@ -2192,7 +2192,7 @@
       <w:tr>
         <w:tc>
           <w:tcPr>
-            <w:tcW w:type="dxa" w:w="2360"/>
+            <w:tcW w:type="dxa" w:w="2340"/>
           </w:tcPr>
           <w:p>
             <w:pPr>
@@ -2210,7 +2210,7 @@
         </w:tc>
         <w:tc>
           <w:tcPr>
-            <w:tcW w:type="dxa" w:w="1656"/>
+            <w:tcW w:type="dxa" w:w="2340"/>
           </w:tcPr>
           <w:p>
             <w:pPr>
@@ -2228,7 +2228,7 @@
         </w:tc>
         <w:tc>
           <w:tcPr>
-            <w:tcW w:type="dxa" w:w="1283"/>
+            <w:tcW w:type="dxa" w:w="2340"/>
           </w:tcPr>
           <w:p>
             <w:pPr>
@@ -2246,7 +2246,7 @@
         </w:tc>
         <w:tc>
           <w:tcPr>
-            <w:tcW w:type="dxa" w:w="4058"/>
+            <w:tcW w:type="dxa" w:w="2340"/>
           </w:tcPr>
           <w:p>
             <w:pPr>
@@ -2266,7 +2266,7 @@
       <w:tr>
         <w:tc>
           <w:tcPr>
-            <w:tcW w:type="dxa" w:w="2360"/>
+            <w:tcW w:type="dxa" w:w="2340"/>
           </w:tcPr>
           <w:p>
             <w:pPr>
@@ -2284,7 +2284,7 @@
         </w:tc>
         <w:tc>
           <w:tcPr>
-            <w:tcW w:type="dxa" w:w="1656"/>
+            <w:tcW w:type="dxa" w:w="2340"/>
           </w:tcPr>
           <w:p>
             <w:pPr>
@@ -2302,7 +2302,7 @@
         </w:tc>
         <w:tc>
           <w:tcPr>
-            <w:tcW w:type="dxa" w:w="1283"/>
+            <w:tcW w:type="dxa" w:w="2340"/>
           </w:tcPr>
           <w:p>
             <w:pPr>
@@ -2320,7 +2320,7 @@
         </w:tc>
         <w:tc>
           <w:tcPr>
-            <w:tcW w:type="dxa" w:w="4058"/>
+            <w:tcW w:type="dxa" w:w="2340"/>
           </w:tcPr>
           <w:p>
             <w:pPr>
@@ -2340,7 +2340,7 @@
       <w:tr>
         <w:tc>
           <w:tcPr>
-            <w:tcW w:type="dxa" w:w="2360"/>
+            <w:tcW w:type="dxa" w:w="2340"/>
           </w:tcPr>
           <w:p>
             <w:pPr>
@@ -2358,7 +2358,7 @@
         </w:tc>
         <w:tc>
           <w:tcPr>
-            <w:tcW w:type="dxa" w:w="1656"/>
+            <w:tcW w:type="dxa" w:w="2340"/>
           </w:tcPr>
           <w:p>
             <w:pPr>
@@ -2376,7 +2376,7 @@
         </w:tc>
         <w:tc>
           <w:tcPr>
-            <w:tcW w:type="dxa" w:w="1283"/>
+            <w:tcW w:type="dxa" w:w="2340"/>
           </w:tcPr>
           <w:p>
             <w:pPr>
@@ -2394,7 +2394,7 @@
         </w:tc>
         <w:tc>
           <w:tcPr>
-            <w:tcW w:type="dxa" w:w="4058"/>
+            <w:tcW w:type="dxa" w:w="2340"/>
           </w:tcPr>
           <w:p>
             <w:pPr>
@@ -2414,7 +2414,7 @@
       <w:tr>
         <w:tc>
           <w:tcPr>
-            <w:tcW w:type="dxa" w:w="2360"/>
+            <w:tcW w:type="dxa" w:w="2340"/>
           </w:tcPr>
           <w:p>
             <w:pPr>
@@ -2432,7 +2432,7 @@
         </w:tc>
         <w:tc>
           <w:tcPr>
-            <w:tcW w:type="dxa" w:w="1656"/>
+            <w:tcW w:type="dxa" w:w="2340"/>
           </w:tcPr>
           <w:p>
             <w:pPr>
@@ -2450,7 +2450,7 @@
         </w:tc>
         <w:tc>
           <w:tcPr>
-            <w:tcW w:type="dxa" w:w="1283"/>
+            <w:tcW w:type="dxa" w:w="2340"/>
           </w:tcPr>
           <w:p>
             <w:pPr>
@@ -2468,7 +2468,7 @@
         </w:tc>
         <w:tc>
           <w:tcPr>
-            <w:tcW w:type="dxa" w:w="4058"/>
+            <w:tcW w:type="dxa" w:w="2340"/>
           </w:tcPr>
           <w:p>
             <w:pPr>
@@ -2488,7 +2488,7 @@
       <w:tr>
         <w:tc>
           <w:tcPr>
-            <w:tcW w:type="dxa" w:w="2360"/>
+            <w:tcW w:type="dxa" w:w="2340"/>
           </w:tcPr>
           <w:p>
             <w:pPr>
@@ -2506,7 +2506,7 @@
         </w:tc>
         <w:tc>
           <w:tcPr>
-            <w:tcW w:type="dxa" w:w="1656"/>
+            <w:tcW w:type="dxa" w:w="2340"/>
           </w:tcPr>
           <w:p>
             <w:pPr>
@@ -2524,7 +2524,7 @@
         </w:tc>
         <w:tc>
           <w:tcPr>
-            <w:tcW w:type="dxa" w:w="1283"/>
+            <w:tcW w:type="dxa" w:w="2340"/>
           </w:tcPr>
           <w:p>
             <w:pPr>
@@ -2542,7 +2542,7 @@
         </w:tc>
         <w:tc>
           <w:tcPr>
-            <w:tcW w:type="dxa" w:w="4058"/>
+            <w:tcW w:type="dxa" w:w="2340"/>
           </w:tcPr>
           <w:p>
             <w:pPr>
@@ -2562,7 +2562,7 @@
       <w:tr>
         <w:tc>
           <w:tcPr>
-            <w:tcW w:type="dxa" w:w="2360"/>
+            <w:tcW w:type="dxa" w:w="2340"/>
           </w:tcPr>
           <w:p>
             <w:pPr>
@@ -2580,7 +2580,7 @@
         </w:tc>
         <w:tc>
           <w:tcPr>
-            <w:tcW w:type="dxa" w:w="1656"/>
+            <w:tcW w:type="dxa" w:w="2340"/>
           </w:tcPr>
           <w:p>
             <w:pPr>
@@ -2598,7 +2598,7 @@
         </w:tc>
         <w:tc>
           <w:tcPr>
-            <w:tcW w:type="dxa" w:w="1283"/>
+            <w:tcW w:type="dxa" w:w="2340"/>
           </w:tcPr>
           <w:p>
             <w:pPr>
@@ -2616,7 +2616,7 @@
         </w:tc>
         <w:tc>
           <w:tcPr>
-            <w:tcW w:type="dxa" w:w="4058"/>
+            <w:tcW w:type="dxa" w:w="2340"/>
           </w:tcPr>
           <w:p>
             <w:pPr>
@@ -2636,7 +2636,7 @@
       <w:tr>
         <w:tc>
           <w:tcPr>
-            <w:tcW w:type="dxa" w:w="2360"/>
+            <w:tcW w:type="dxa" w:w="2340"/>
           </w:tcPr>
           <w:p>
             <w:pPr>
@@ -2654,7 +2654,7 @@
         </w:tc>
         <w:tc>
           <w:tcPr>
-            <w:tcW w:type="dxa" w:w="1656"/>
+            <w:tcW w:type="dxa" w:w="2340"/>
           </w:tcPr>
           <w:p>
             <w:pPr>
@@ -2672,7 +2672,7 @@
         </w:tc>
         <w:tc>
           <w:tcPr>
-            <w:tcW w:type="dxa" w:w="1283"/>
+            <w:tcW w:type="dxa" w:w="2340"/>
           </w:tcPr>
           <w:p>
             <w:pPr>
@@ -2690,7 +2690,7 @@
         </w:tc>
         <w:tc>
           <w:tcPr>
-            <w:tcW w:type="dxa" w:w="4058"/>
+            <w:tcW w:type="dxa" w:w="2340"/>
           </w:tcPr>
           <w:p>
             <w:pPr>
@@ -2710,7 +2710,7 @@
       <w:tr>
         <w:tc>
           <w:tcPr>
-            <w:tcW w:type="dxa" w:w="2360"/>
+            <w:tcW w:type="dxa" w:w="2340"/>
           </w:tcPr>
           <w:p>
             <w:pPr>
@@ -2728,7 +2728,7 @@
         </w:tc>
         <w:tc>
           <w:tcPr>
-            <w:tcW w:type="dxa" w:w="1656"/>
+            <w:tcW w:type="dxa" w:w="2340"/>
           </w:tcPr>
           <w:p>
             <w:pPr>
@@ -2746,7 +2746,7 @@
         </w:tc>
         <w:tc>
           <w:tcPr>
-            <w:tcW w:type="dxa" w:w="1283"/>
+            <w:tcW w:type="dxa" w:w="2340"/>
           </w:tcPr>
           <w:p>
             <w:pPr>
@@ -2764,7 +2764,7 @@
         </w:tc>
         <w:tc>
           <w:tcPr>
-            <w:tcW w:type="dxa" w:w="4058"/>
+            <w:tcW w:type="dxa" w:w="2340"/>
           </w:tcPr>
           <w:p>
             <w:pPr>
@@ -2784,7 +2784,7 @@
       <w:tr>
         <w:tc>
           <w:tcPr>
-            <w:tcW w:type="dxa" w:w="2360"/>
+            <w:tcW w:type="dxa" w:w="2340"/>
           </w:tcPr>
           <w:p>
             <w:pPr>
@@ -2802,7 +2802,7 @@
         </w:tc>
         <w:tc>
           <w:tcPr>
-            <w:tcW w:type="dxa" w:w="1656"/>
+            <w:tcW w:type="dxa" w:w="2340"/>
           </w:tcPr>
           <w:p>
             <w:pPr>
@@ -2820,7 +2820,7 @@
         </w:tc>
         <w:tc>
           <w:tcPr>
-            <w:tcW w:type="dxa" w:w="1283"/>
+            <w:tcW w:type="dxa" w:w="2340"/>
           </w:tcPr>
           <w:p>
             <w:pPr>
@@ -2838,7 +2838,7 @@
         </w:tc>
         <w:tc>
           <w:tcPr>
-            <w:tcW w:type="dxa" w:w="4058"/>
+            <w:tcW w:type="dxa" w:w="2340"/>
           </w:tcPr>
           <w:p>
             <w:pPr>
@@ -2858,7 +2858,7 @@
       <w:tr>
         <w:tc>
           <w:tcPr>
-            <w:tcW w:type="dxa" w:w="2360"/>
+            <w:tcW w:type="dxa" w:w="2340"/>
           </w:tcPr>
           <w:p>
             <w:pPr>
@@ -2876,7 +2876,7 @@
         </w:tc>
         <w:tc>
           <w:tcPr>
-            <w:tcW w:type="dxa" w:w="1656"/>
+            <w:tcW w:type="dxa" w:w="2340"/>
           </w:tcPr>
           <w:p>
             <w:pPr>
@@ -2894,7 +2894,7 @@
         </w:tc>
         <w:tc>
           <w:tcPr>
-            <w:tcW w:type="dxa" w:w="1283"/>
+            <w:tcW w:type="dxa" w:w="2340"/>
           </w:tcPr>
           <w:p>
             <w:pPr>
@@ -2912,7 +2912,7 @@
         </w:tc>
         <w:tc>
           <w:tcPr>
-            <w:tcW w:type="dxa" w:w="4058"/>
+            <w:tcW w:type="dxa" w:w="2340"/>
           </w:tcPr>
           <w:p>
             <w:pPr>
@@ -2932,7 +2932,7 @@
       <w:tr>
         <w:tc>
           <w:tcPr>
-            <w:tcW w:type="dxa" w:w="2360"/>
+            <w:tcW w:type="dxa" w:w="2340"/>
           </w:tcPr>
           <w:p>
             <w:pPr>
@@ -2950,7 +2950,7 @@
         </w:tc>
         <w:tc>
           <w:tcPr>
-            <w:tcW w:type="dxa" w:w="1656"/>
+            <w:tcW w:type="dxa" w:w="2340"/>
           </w:tcPr>
           <w:p>
             <w:pPr>
@@ -2968,7 +2968,7 @@
         </w:tc>
         <w:tc>
           <w:tcPr>
-            <w:tcW w:type="dxa" w:w="1283"/>
+            <w:tcW w:type="dxa" w:w="2340"/>
           </w:tcPr>
           <w:p>
             <w:pPr>
@@ -2986,7 +2986,7 @@
         </w:tc>
         <w:tc>
           <w:tcPr>
-            <w:tcW w:type="dxa" w:w="4058"/>
+            <w:tcW w:type="dxa" w:w="2340"/>
           </w:tcPr>
           <w:p>
             <w:pPr>
@@ -3006,7 +3006,7 @@
       <w:tr>
         <w:tc>
           <w:tcPr>
-            <w:tcW w:type="dxa" w:w="2360"/>
+            <w:tcW w:type="dxa" w:w="2340"/>
           </w:tcPr>
           <w:p>
             <w:pPr>
@@ -3024,7 +3024,7 @@
         </w:tc>
         <w:tc>
           <w:tcPr>
-            <w:tcW w:type="dxa" w:w="1656"/>
+            <w:tcW w:type="dxa" w:w="2340"/>
           </w:tcPr>
           <w:p>
             <w:pPr>
@@ -3042,7 +3042,7 @@
         </w:tc>
         <w:tc>
           <w:tcPr>
-            <w:tcW w:type="dxa" w:w="1283"/>
+            <w:tcW w:type="dxa" w:w="2340"/>
           </w:tcPr>
           <w:p>
             <w:pPr>
@@ -3060,7 +3060,7 @@
         </w:tc>
         <w:tc>
           <w:tcPr>
-            <w:tcW w:type="dxa" w:w="4058"/>
+            <w:tcW w:type="dxa" w:w="2340"/>
           </w:tcPr>
           <w:p>
             <w:pPr>
@@ -3080,7 +3080,7 @@
       <w:tr>
         <w:tc>
           <w:tcPr>
-            <w:tcW w:type="dxa" w:w="2360"/>
+            <w:tcW w:type="dxa" w:w="2340"/>
           </w:tcPr>
           <w:p>
             <w:pPr>
@@ -3098,7 +3098,7 @@
         </w:tc>
         <w:tc>
           <w:tcPr>
-            <w:tcW w:type="dxa" w:w="1656"/>
+            <w:tcW w:type="dxa" w:w="2340"/>
           </w:tcPr>
           <w:p>
             <w:pPr>
@@ -3116,7 +3116,7 @@
         </w:tc>
         <w:tc>
           <w:tcPr>
-            <w:tcW w:type="dxa" w:w="1283"/>
+            <w:tcW w:type="dxa" w:w="2340"/>
           </w:tcPr>
           <w:p>
             <w:pPr>
@@ -3134,7 +3134,7 @@
         </w:tc>
         <w:tc>
           <w:tcPr>
-            <w:tcW w:type="dxa" w:w="4058"/>
+            <w:tcW w:type="dxa" w:w="2340"/>
           </w:tcPr>
           <w:p>
             <w:pPr>
@@ -3154,7 +3154,7 @@
       <w:tr>
         <w:tc>
           <w:tcPr>
-            <w:tcW w:type="dxa" w:w="2360"/>
+            <w:tcW w:type="dxa" w:w="2340"/>
           </w:tcPr>
           <w:p>
             <w:pPr>
@@ -3172,7 +3172,7 @@
         </w:tc>
         <w:tc>
           <w:tcPr>
-            <w:tcW w:type="dxa" w:w="1656"/>
+            <w:tcW w:type="dxa" w:w="2340"/>
           </w:tcPr>
           <w:p>
             <w:pPr>
@@ -3190,7 +3190,7 @@
         </w:tc>
         <w:tc>
           <w:tcPr>
-            <w:tcW w:type="dxa" w:w="1283"/>
+            <w:tcW w:type="dxa" w:w="2340"/>
           </w:tcPr>
           <w:p>
             <w:pPr>
@@ -3208,7 +3208,7 @@
         </w:tc>
         <w:tc>
           <w:tcPr>
-            <w:tcW w:type="dxa" w:w="4058"/>
+            <w:tcW w:type="dxa" w:w="2340"/>
           </w:tcPr>
           <w:p>
             <w:pPr>
@@ -3228,7 +3228,7 @@
       <w:tr>
         <w:tc>
           <w:tcPr>
-            <w:tcW w:type="dxa" w:w="2360"/>
+            <w:tcW w:type="dxa" w:w="2340"/>
           </w:tcPr>
           <w:p>
             <w:pPr>
@@ -3246,7 +3246,7 @@
         </w:tc>
         <w:tc>
           <w:tcPr>
-            <w:tcW w:type="dxa" w:w="1656"/>
+            <w:tcW w:type="dxa" w:w="2340"/>
           </w:tcPr>
           <w:p>
             <w:pPr>
@@ -3558,7 +3558,7 @@
         </w:tc>
         <w:tc>
           <w:tcPr>
-            <w:tcW w:type="dxa" w:w="1283"/>
+            <w:tcW w:type="dxa" w:w="2340"/>
           </w:tcPr>
           <w:p>
             <w:pPr>
@@ -3576,7 +3576,7 @@
         </w:tc>
         <w:tc>
           <w:tcPr>
-            <w:tcW w:type="dxa" w:w="4058"/>
+            <w:tcW w:type="dxa" w:w="2340"/>
           </w:tcPr>
           <w:p>
             <w:pPr>
@@ -3596,7 +3596,7 @@
       <w:tr>
         <w:tc>
           <w:tcPr>
-            <w:tcW w:type="dxa" w:w="2360"/>
+            <w:tcW w:type="dxa" w:w="2340"/>
           </w:tcPr>
           <w:p>
             <w:pPr>
@@ -3614,7 +3614,7 @@
         </w:tc>
         <w:tc>
           <w:tcPr>
-            <w:tcW w:type="dxa" w:w="1656"/>
+            <w:tcW w:type="dxa" w:w="2340"/>
           </w:tcPr>
           <w:p>
             <w:pPr>
@@ -3806,7 +3806,7 @@
         </w:tc>
         <w:tc>
           <w:tcPr>
-            <w:tcW w:type="dxa" w:w="1283"/>
+            <w:tcW w:type="dxa" w:w="2340"/>
           </w:tcPr>
           <w:p>
             <w:pPr>
@@ -3824,7 +3824,7 @@
         </w:tc>
         <w:tc>
           <w:tcPr>
-            <w:tcW w:type="dxa" w:w="4058"/>
+            <w:tcW w:type="dxa" w:w="2340"/>
           </w:tcPr>
           <w:p>
             <w:pPr>
@@ -3844,7 +3844,7 @@
       <w:tr>
         <w:tc>
           <w:tcPr>
-            <w:tcW w:type="dxa" w:w="2360"/>
+            <w:tcW w:type="dxa" w:w="2340"/>
           </w:tcPr>
           <w:p>
             <w:pPr>
@@ -3862,7 +3862,7 @@
         </w:tc>
         <w:tc>
           <w:tcPr>
-            <w:tcW w:type="dxa" w:w="1656"/>
+            <w:tcW w:type="dxa" w:w="2340"/>
           </w:tcPr>
           <w:p>
             <w:pPr>
@@ -3880,7 +3880,7 @@
         </w:tc>
         <w:tc>
           <w:tcPr>
-            <w:tcW w:type="dxa" w:w="1283"/>
+            <w:tcW w:type="dxa" w:w="2340"/>
           </w:tcPr>
           <w:p>
             <w:pPr>
@@ -3898,7 +3898,7 @@
         </w:tc>
         <w:tc>
           <w:tcPr>
-            <w:tcW w:type="dxa" w:w="4058"/>
+            <w:tcW w:type="dxa" w:w="2340"/>
           </w:tcPr>
           <w:p>
             <w:pPr>
@@ -3918,7 +3918,7 @@
       <w:tr>
         <w:tc>
           <w:tcPr>
-            <w:tcW w:type="dxa" w:w="2360"/>
+            <w:tcW w:type="dxa" w:w="2340"/>
           </w:tcPr>
           <w:p>
             <w:pPr>
@@ -3936,7 +3936,7 @@
         </w:tc>
         <w:tc>
           <w:tcPr>
-            <w:tcW w:type="dxa" w:w="1656"/>
+            <w:tcW w:type="dxa" w:w="2340"/>
           </w:tcPr>
           <w:p>
             <w:pPr>
@@ -3954,7 +3954,7 @@
         </w:tc>
         <w:tc>
           <w:tcPr>
-            <w:tcW w:type="dxa" w:w="1283"/>
+            <w:tcW w:type="dxa" w:w="2340"/>
           </w:tcPr>
           <w:p>
             <w:pPr>
@@ -3972,7 +3972,7 @@
         </w:tc>
         <w:tc>
           <w:tcPr>
-            <w:tcW w:type="dxa" w:w="4058"/>
+            <w:tcW w:type="dxa" w:w="2340"/>
           </w:tcPr>
           <w:p>
             <w:pPr>
@@ -3992,7 +3992,7 @@
       <w:tr>
         <w:tc>
           <w:tcPr>
-            <w:tcW w:type="dxa" w:w="2360"/>
+            <w:tcW w:type="dxa" w:w="2340"/>
           </w:tcPr>
           <w:p>
             <w:pPr>
@@ -4010,7 +4010,7 @@
         </w:tc>
         <w:tc>
           <w:tcPr>
-            <w:tcW w:type="dxa" w:w="1656"/>
+            <w:tcW w:type="dxa" w:w="2340"/>
           </w:tcPr>
           <w:p>
             <w:pPr>
@@ -4028,7 +4028,7 @@
         </w:tc>
         <w:tc>
           <w:tcPr>
-            <w:tcW w:type="dxa" w:w="1283"/>
+            <w:tcW w:type="dxa" w:w="2340"/>
           </w:tcPr>
           <w:p>
             <w:pPr>
@@ -4046,7 +4046,7 @@
         </w:tc>
         <w:tc>
           <w:tcPr>
-            <w:tcW w:type="dxa" w:w="4058"/>
+            <w:tcW w:type="dxa" w:w="2340"/>
           </w:tcPr>
           <w:p>
             <w:pPr>
@@ -4066,7 +4066,7 @@
       <w:tr>
         <w:tc>
           <w:tcPr>
-            <w:tcW w:type="dxa" w:w="2360"/>
+            <w:tcW w:type="dxa" w:w="2340"/>
           </w:tcPr>
           <w:p>
             <w:pPr>
@@ -4084,7 +4084,7 @@
         </w:tc>
         <w:tc>
           <w:tcPr>
-            <w:tcW w:type="dxa" w:w="1656"/>
+            <w:tcW w:type="dxa" w:w="2340"/>
           </w:tcPr>
           <w:p>
             <w:pPr>
@@ -4102,7 +4102,7 @@
         </w:tc>
         <w:tc>
           <w:tcPr>
-            <w:tcW w:type="dxa" w:w="1283"/>
+            <w:tcW w:type="dxa" w:w="2340"/>
           </w:tcPr>
           <w:p>
             <w:pPr>
@@ -4120,7 +4120,7 @@
         </w:tc>
         <w:tc>
           <w:tcPr>
-            <w:tcW w:type="dxa" w:w="4058"/>
+            <w:tcW w:type="dxa" w:w="2340"/>
           </w:tcPr>
           <w:p>
             <w:pPr>
@@ -4140,7 +4140,7 @@
       <w:tr>
         <w:tc>
           <w:tcPr>
-            <w:tcW w:type="dxa" w:w="2360"/>
+            <w:tcW w:type="dxa" w:w="2340"/>
           </w:tcPr>
           <w:p>
             <w:pPr>
@@ -4158,7 +4158,7 @@
         </w:tc>
         <w:tc>
           <w:tcPr>
-            <w:tcW w:type="dxa" w:w="1656"/>
+            <w:tcW w:type="dxa" w:w="2340"/>
           </w:tcPr>
           <w:p>
             <w:pPr>
@@ -4176,7 +4176,7 @@
         </w:tc>
         <w:tc>
           <w:tcPr>
-            <w:tcW w:type="dxa" w:w="1283"/>
+            <w:tcW w:type="dxa" w:w="2340"/>
           </w:tcPr>
           <w:p>
             <w:pPr>
@@ -4194,7 +4194,7 @@
         </w:tc>
         <w:tc>
           <w:tcPr>
-            <w:tcW w:type="dxa" w:w="4058"/>
+            <w:tcW w:type="dxa" w:w="2340"/>
           </w:tcPr>
           <w:p>
             <w:pPr>
@@ -4214,7 +4214,7 @@
       <w:tr>
         <w:tc>
           <w:tcPr>
-            <w:tcW w:type="dxa" w:w="2360"/>
+            <w:tcW w:type="dxa" w:w="2340"/>
           </w:tcPr>
           <w:p>
             <w:pPr>
@@ -4232,7 +4232,7 @@
         </w:tc>
         <w:tc>
           <w:tcPr>
-            <w:tcW w:type="dxa" w:w="1656"/>
+            <w:tcW w:type="dxa" w:w="2340"/>
           </w:tcPr>
           <w:p>
             <w:pPr>
@@ -4250,7 +4250,7 @@
         </w:tc>
         <w:tc>
           <w:tcPr>
-            <w:tcW w:type="dxa" w:w="1283"/>
+            <w:tcW w:type="dxa" w:w="2340"/>
           </w:tcPr>
           <w:p>
             <w:pPr>
@@ -4268,7 +4268,7 @@
         </w:tc>
         <w:tc>
           <w:tcPr>
-            <w:tcW w:type="dxa" w:w="4058"/>
+            <w:tcW w:type="dxa" w:w="2340"/>
           </w:tcPr>
           <w:p>
             <w:pPr>
@@ -4288,7 +4288,7 @@
       <w:tr>
         <w:tc>
           <w:tcPr>
-            <w:tcW w:type="dxa" w:w="2360"/>
+            <w:tcW w:type="dxa" w:w="2340"/>
           </w:tcPr>
           <w:p>
             <w:pPr>
@@ -4306,7 +4306,7 @@
         </w:tc>
         <w:tc>
           <w:tcPr>
-            <w:tcW w:type="dxa" w:w="1656"/>
+            <w:tcW w:type="dxa" w:w="2340"/>
           </w:tcPr>
           <w:p>
             <w:pPr>
@@ -4324,7 +4324,7 @@
         </w:tc>
         <w:tc>
           <w:tcPr>
-            <w:tcW w:type="dxa" w:w="1283"/>
+            <w:tcW w:type="dxa" w:w="2340"/>
           </w:tcPr>
           <w:p>
             <w:pPr>
@@ -4342,7 +4342,7 @@
         </w:tc>
         <w:tc>
           <w:tcPr>
-            <w:tcW w:type="dxa" w:w="4058"/>
+            <w:tcW w:type="dxa" w:w="2340"/>
           </w:tcPr>
           <w:p>
             <w:pPr>
@@ -4362,7 +4362,7 @@
       <w:tr>
         <w:tc>
           <w:tcPr>
-            <w:tcW w:type="dxa" w:w="2360"/>
+            <w:tcW w:type="dxa" w:w="2340"/>
           </w:tcPr>
           <w:p>
             <w:pPr>
@@ -4380,7 +4380,7 @@
         </w:tc>
         <w:tc>
           <w:tcPr>
-            <w:tcW w:type="dxa" w:w="1656"/>
+            <w:tcW w:type="dxa" w:w="2340"/>
           </w:tcPr>
           <w:p>
             <w:pPr>
@@ -4398,7 +4398,7 @@
         </w:tc>
         <w:tc>
           <w:tcPr>
-            <w:tcW w:type="dxa" w:w="1283"/>
+            <w:tcW w:type="dxa" w:w="2340"/>
           </w:tcPr>
           <w:p>
             <w:pPr>
@@ -4416,7 +4416,7 @@
         </w:tc>
         <w:tc>
           <w:tcPr>
-            <w:tcW w:type="dxa" w:w="4058"/>
+            <w:tcW w:type="dxa" w:w="2340"/>
           </w:tcPr>
           <w:p>
             <w:pPr>
@@ -4436,7 +4436,7 @@
       <w:tr>
         <w:tc>
           <w:tcPr>
-            <w:tcW w:type="dxa" w:w="2360"/>
+            <w:tcW w:type="dxa" w:w="2340"/>
           </w:tcPr>
           <w:p>
             <w:pPr>
@@ -4454,7 +4454,7 @@
         </w:tc>
         <w:tc>
           <w:tcPr>
-            <w:tcW w:type="dxa" w:w="1656"/>
+            <w:tcW w:type="dxa" w:w="2340"/>
           </w:tcPr>
           <w:p>
             <w:pPr>
@@ -4472,7 +4472,7 @@
         </w:tc>
         <w:tc>
           <w:tcPr>
-            <w:tcW w:type="dxa" w:w="1283"/>
+            <w:tcW w:type="dxa" w:w="2340"/>
           </w:tcPr>
           <w:p>
             <w:pPr>
@@ -4490,7 +4490,7 @@
         </w:tc>
         <w:tc>
           <w:tcPr>
-            <w:tcW w:type="dxa" w:w="4058"/>
+            <w:tcW w:type="dxa" w:w="2340"/>
           </w:tcPr>
           <w:p>
             <w:pPr>
@@ -4510,7 +4510,7 @@
       <w:tr>
         <w:tc>
           <w:tcPr>
-            <w:tcW w:type="dxa" w:w="2360"/>
+            <w:tcW w:type="dxa" w:w="2340"/>
           </w:tcPr>
           <w:p>
             <w:pPr>
@@ -4528,7 +4528,7 @@
         </w:tc>
         <w:tc>
           <w:tcPr>
-            <w:tcW w:type="dxa" w:w="1656"/>
+            <w:tcW w:type="dxa" w:w="2340"/>
           </w:tcPr>
           <w:p>
             <w:pPr>
@@ -4546,7 +4546,7 @@
         </w:tc>
         <w:tc>
           <w:tcPr>
-            <w:tcW w:type="dxa" w:w="1283"/>
+            <w:tcW w:type="dxa" w:w="2340"/>
           </w:tcPr>
           <w:p>
             <w:pPr>
@@ -4564,7 +4564,7 @@
         </w:tc>
         <w:tc>
           <w:tcPr>
-            <w:tcW w:type="dxa" w:w="4058"/>
+            <w:tcW w:type="dxa" w:w="2340"/>
           </w:tcPr>
           <w:p>
             <w:pPr>
@@ -4584,7 +4584,7 @@
       <w:tr>
         <w:tc>
           <w:tcPr>
-            <w:tcW w:type="dxa" w:w="2360"/>
+            <w:tcW w:type="dxa" w:w="2340"/>
           </w:tcPr>
           <w:p>
             <w:pPr>
@@ -4602,7 +4602,7 @@
         </w:tc>
         <w:tc>
           <w:tcPr>
-            <w:tcW w:type="dxa" w:w="1656"/>
+            <w:tcW w:type="dxa" w:w="2340"/>
           </w:tcPr>
           <w:p>
             <w:pPr>
@@ -4620,7 +4620,7 @@
         </w:tc>
         <w:tc>
           <w:tcPr>
-            <w:tcW w:type="dxa" w:w="1283"/>
+            <w:tcW w:type="dxa" w:w="2340"/>
           </w:tcPr>
           <w:p>
             <w:pPr>
@@ -4638,7 +4638,7 @@
         </w:tc>
         <w:tc>
           <w:tcPr>
-            <w:tcW w:type="dxa" w:w="4058"/>
+            <w:tcW w:type="dxa" w:w="2340"/>
           </w:tcPr>
           <w:p>
             <w:pPr>
@@ -4658,7 +4658,7 @@
       <w:tr>
         <w:tc>
           <w:tcPr>
-            <w:tcW w:type="dxa" w:w="2360"/>
+            <w:tcW w:type="dxa" w:w="2340"/>
           </w:tcPr>
           <w:p>
             <w:pPr>
@@ -4676,7 +4676,7 @@
         </w:tc>
         <w:tc>
           <w:tcPr>
-            <w:tcW w:type="dxa" w:w="1656"/>
+            <w:tcW w:type="dxa" w:w="2340"/>
           </w:tcPr>
           <w:p>
             <w:pPr>
@@ -4694,7 +4694,7 @@
         </w:tc>
         <w:tc>
           <w:tcPr>
-            <w:tcW w:type="dxa" w:w="1283"/>
+            <w:tcW w:type="dxa" w:w="2340"/>
           </w:tcPr>
           <w:p>
             <w:pPr>
@@ -4712,7 +4712,7 @@
         </w:tc>
         <w:tc>
           <w:tcPr>
-            <w:tcW w:type="dxa" w:w="4058"/>
+            <w:tcW w:type="dxa" w:w="2340"/>
           </w:tcPr>
           <w:p>
             <w:pPr>
@@ -4732,7 +4732,7 @@
       <w:tr>
         <w:tc>
           <w:tcPr>
-            <w:tcW w:type="dxa" w:w="2360"/>
+            <w:tcW w:type="dxa" w:w="2340"/>
           </w:tcPr>
           <w:p>
             <w:pPr>
@@ -4750,7 +4750,7 @@
         </w:tc>
         <w:tc>
           <w:tcPr>
-            <w:tcW w:type="dxa" w:w="1656"/>
+            <w:tcW w:type="dxa" w:w="2340"/>
           </w:tcPr>
           <w:p>
             <w:pPr>
@@ -4768,7 +4768,7 @@
         </w:tc>
         <w:tc>
           <w:tcPr>
-            <w:tcW w:type="dxa" w:w="1283"/>
+            <w:tcW w:type="dxa" w:w="2340"/>
           </w:tcPr>
           <w:p>
             <w:pPr>
@@ -4786,7 +4786,7 @@
         </w:tc>
         <w:tc>
           <w:tcPr>
-            <w:tcW w:type="dxa" w:w="4058"/>
+            <w:tcW w:type="dxa" w:w="2340"/>
           </w:tcPr>
           <w:p>
             <w:pPr>
@@ -4806,7 +4806,7 @@
       <w:tr>
         <w:tc>
           <w:tcPr>
-            <w:tcW w:type="dxa" w:w="2360"/>
+            <w:tcW w:type="dxa" w:w="2340"/>
           </w:tcPr>
           <w:p>
             <w:pPr>
@@ -4824,7 +4824,7 @@
         </w:tc>
         <w:tc>
           <w:tcPr>
-            <w:tcW w:type="dxa" w:w="1656"/>
+            <w:tcW w:type="dxa" w:w="2340"/>
           </w:tcPr>
           <w:p>
             <w:pPr>
@@ -4842,7 +4842,7 @@
         </w:tc>
         <w:tc>
           <w:tcPr>
-            <w:tcW w:type="dxa" w:w="1283"/>
+            <w:tcW w:type="dxa" w:w="2340"/>
           </w:tcPr>
           <w:p>
             <w:pPr>
@@ -4860,7 +4860,7 @@
         </w:tc>
         <w:tc>
           <w:tcPr>
-            <w:tcW w:type="dxa" w:w="4058"/>
+            <w:tcW w:type="dxa" w:w="2340"/>
           </w:tcPr>
           <w:p>
             <w:pPr>
@@ -4880,7 +4880,7 @@
       <w:tr>
         <w:tc>
           <w:tcPr>
-            <w:tcW w:type="dxa" w:w="2360"/>
+            <w:tcW w:type="dxa" w:w="2340"/>
           </w:tcPr>
           <w:p>
             <w:pPr>
@@ -4898,7 +4898,7 @@
         </w:tc>
         <w:tc>
           <w:tcPr>
-            <w:tcW w:type="dxa" w:w="1656"/>
+            <w:tcW w:type="dxa" w:w="2340"/>
           </w:tcPr>
           <w:p>
             <w:pPr>
@@ -4916,7 +4916,7 @@
         </w:tc>
         <w:tc>
           <w:tcPr>
-            <w:tcW w:type="dxa" w:w="1283"/>
+            <w:tcW w:type="dxa" w:w="2340"/>
           </w:tcPr>
           <w:p>
             <w:pPr>
@@ -4934,7 +4934,7 @@
         </w:tc>
         <w:tc>
           <w:tcPr>
-            <w:tcW w:type="dxa" w:w="4058"/>
+            <w:tcW w:type="dxa" w:w="2340"/>
           </w:tcPr>
           <w:p>
             <w:pPr>
@@ -4954,7 +4954,7 @@
       <w:tr>
         <w:tc>
           <w:tcPr>
-            <w:tcW w:type="dxa" w:w="2360"/>
+            <w:tcW w:type="dxa" w:w="2340"/>
           </w:tcPr>
           <w:p>
             <w:pPr>
@@ -4972,7 +4972,7 @@
         </w:tc>
         <w:tc>
           <w:tcPr>
-            <w:tcW w:type="dxa" w:w="1656"/>
+            <w:tcW w:type="dxa" w:w="2340"/>
           </w:tcPr>
           <w:p>
             <w:pPr>
@@ -4990,7 +4990,7 @@
         </w:tc>
         <w:tc>
           <w:tcPr>
-            <w:tcW w:type="dxa" w:w="1283"/>
+            <w:tcW w:type="dxa" w:w="2340"/>
           </w:tcPr>
           <w:p>
             <w:pPr>
@@ -5008,7 +5008,7 @@
         </w:tc>
         <w:tc>
           <w:tcPr>
-            <w:tcW w:type="dxa" w:w="4058"/>
+            <w:tcW w:type="dxa" w:w="2340"/>
           </w:tcPr>
           <w:p>
             <w:pPr>
@@ -5028,7 +5028,7 @@
       <w:tr>
         <w:tc>
           <w:tcPr>
-            <w:tcW w:type="dxa" w:w="2360"/>
+            <w:tcW w:type="dxa" w:w="2340"/>
           </w:tcPr>
           <w:p>
             <w:pPr>
@@ -5046,7 +5046,7 @@
         </w:tc>
         <w:tc>
           <w:tcPr>
-            <w:tcW w:type="dxa" w:w="1656"/>
+            <w:tcW w:type="dxa" w:w="2340"/>
           </w:tcPr>
           <w:p>
             <w:pPr>
@@ -5064,7 +5064,7 @@
         </w:tc>
         <w:tc>
           <w:tcPr>
-            <w:tcW w:type="dxa" w:w="1283"/>
+            <w:tcW w:type="dxa" w:w="2340"/>
           </w:tcPr>
           <w:p>
             <w:pPr>
@@ -5082,7 +5082,7 @@
         </w:tc>
         <w:tc>
           <w:tcPr>
-            <w:tcW w:type="dxa" w:w="4058"/>
+            <w:tcW w:type="dxa" w:w="2340"/>
           </w:tcPr>
           <w:p>
             <w:pPr>
@@ -5102,7 +5102,7 @@
       <w:tr>
         <w:tc>
           <w:tcPr>
-            <w:tcW w:type="dxa" w:w="2360"/>
+            <w:tcW w:type="dxa" w:w="2340"/>
           </w:tcPr>
           <w:p>
             <w:pPr>
@@ -5120,7 +5120,7 @@
         </w:tc>
         <w:tc>
           <w:tcPr>
-            <w:tcW w:type="dxa" w:w="1656"/>
+            <w:tcW w:type="dxa" w:w="2340"/>
           </w:tcPr>
           <w:p>
             <w:pPr>
@@ -5138,7 +5138,7 @@
         </w:tc>
         <w:tc>
           <w:tcPr>
-            <w:tcW w:type="dxa" w:w="1283"/>
+            <w:tcW w:type="dxa" w:w="2340"/>
           </w:tcPr>
           <w:p>
             <w:pPr>
@@ -5156,7 +5156,7 @@
         </w:tc>
         <w:tc>
           <w:tcPr>
-            <w:tcW w:type="dxa" w:w="4058"/>
+            <w:tcW w:type="dxa" w:w="2340"/>
           </w:tcPr>
           <w:p>
             <w:pPr>
@@ -5176,7 +5176,7 @@
       <w:tr>
         <w:tc>
           <w:tcPr>
-            <w:tcW w:type="dxa" w:w="2360"/>
+            <w:tcW w:type="dxa" w:w="2340"/>
           </w:tcPr>
           <w:p>
             <w:pPr>
@@ -5194,7 +5194,7 @@
         </w:tc>
         <w:tc>
           <w:tcPr>
-            <w:tcW w:type="dxa" w:w="1656"/>
+            <w:tcW w:type="dxa" w:w="2340"/>
           </w:tcPr>
           <w:p>
             <w:pPr>
@@ -5212,7 +5212,7 @@
         </w:tc>
         <w:tc>
           <w:tcPr>
-            <w:tcW w:type="dxa" w:w="1283"/>
+            <w:tcW w:type="dxa" w:w="2340"/>
           </w:tcPr>
           <w:p>
             <w:pPr>
@@ -5230,7 +5230,7 @@
         </w:tc>
         <w:tc>
           <w:tcPr>
-            <w:tcW w:type="dxa" w:w="4058"/>
+            <w:tcW w:type="dxa" w:w="2340"/>
           </w:tcPr>
           <w:p>
             <w:pPr>
@@ -5250,7 +5250,7 @@
       <w:tr>
         <w:tc>
           <w:tcPr>
-            <w:tcW w:type="dxa" w:w="2360"/>
+            <w:tcW w:type="dxa" w:w="2340"/>
           </w:tcPr>
           <w:p>
             <w:pPr>
@@ -5268,7 +5268,7 @@
         </w:tc>
         <w:tc>
           <w:tcPr>
-            <w:tcW w:type="dxa" w:w="1656"/>
+            <w:tcW w:type="dxa" w:w="2340"/>
           </w:tcPr>
           <w:p>
             <w:pPr>
@@ -5286,7 +5286,7 @@
         </w:tc>
         <w:tc>
           <w:tcPr>
-            <w:tcW w:type="dxa" w:w="1283"/>
+            <w:tcW w:type="dxa" w:w="2340"/>
           </w:tcPr>
           <w:p>
             <w:pPr>
@@ -5304,7 +5304,7 @@
         </w:tc>
         <w:tc>
           <w:tcPr>
-            <w:tcW w:type="dxa" w:w="4058"/>
+            <w:tcW w:type="dxa" w:w="2340"/>
           </w:tcPr>
           <w:p>
             <w:pPr>
@@ -5324,7 +5324,7 @@
       <w:tr>
         <w:tc>
           <w:tcPr>
-            <w:tcW w:type="dxa" w:w="2360"/>
+            <w:tcW w:type="dxa" w:w="2340"/>
           </w:tcPr>
           <w:p>
             <w:pPr>
@@ -5342,7 +5342,7 @@
         </w:tc>
         <w:tc>
           <w:tcPr>
-            <w:tcW w:type="dxa" w:w="1656"/>
+            <w:tcW w:type="dxa" w:w="2340"/>
           </w:tcPr>
           <w:p>
             <w:pPr>
@@ -5360,7 +5360,7 @@
         </w:tc>
         <w:tc>
           <w:tcPr>
-            <w:tcW w:type="dxa" w:w="1283"/>
+            <w:tcW w:type="dxa" w:w="2340"/>
           </w:tcPr>
           <w:p>
             <w:pPr>
@@ -5378,7 +5378,7 @@
         </w:tc>
         <w:tc>
           <w:tcPr>
-            <w:tcW w:type="dxa" w:w="4058"/>
+            <w:tcW w:type="dxa" w:w="2340"/>
           </w:tcPr>
           <w:p>
             <w:pPr>
@@ -5398,7 +5398,7 @@
       <w:tr>
         <w:tc>
           <w:tcPr>
-            <w:tcW w:type="dxa" w:w="2360"/>
+            <w:tcW w:type="dxa" w:w="2340"/>
           </w:tcPr>
           <w:p>
             <w:pPr>
@@ -5416,7 +5416,7 @@
         </w:tc>
         <w:tc>
           <w:tcPr>
-            <w:tcW w:type="dxa" w:w="1656"/>
+            <w:tcW w:type="dxa" w:w="2340"/>
           </w:tcPr>
           <w:p>
             <w:pPr>
@@ -5434,7 +5434,7 @@
         </w:tc>
         <w:tc>
           <w:tcPr>
-            <w:tcW w:type="dxa" w:w="1283"/>
+            <w:tcW w:type="dxa" w:w="2340"/>
           </w:tcPr>
           <w:p>
             <w:pPr>
@@ -5452,7 +5452,7 @@
         </w:tc>
         <w:tc>
           <w:tcPr>
-            <w:tcW w:type="dxa" w:w="4058"/>
+            <w:tcW w:type="dxa" w:w="2340"/>
           </w:tcPr>
           <w:p>
             <w:pPr>
@@ -5472,7 +5472,7 @@
       <w:tr>
         <w:tc>
           <w:tcPr>
-            <w:tcW w:type="dxa" w:w="2360"/>
+            <w:tcW w:type="dxa" w:w="2340"/>
           </w:tcPr>
           <w:p>
             <w:pPr>
@@ -5490,7 +5490,7 @@
         </w:tc>
         <w:tc>
           <w:tcPr>
-            <w:tcW w:type="dxa" w:w="1656"/>
+            <w:tcW w:type="dxa" w:w="2340"/>
           </w:tcPr>
           <w:p>
             <w:pPr>
@@ -5508,7 +5508,7 @@
         </w:tc>
         <w:tc>
           <w:tcPr>
-            <w:tcW w:type="dxa" w:w="1283"/>
+            <w:tcW w:type="dxa" w:w="2340"/>
           </w:tcPr>
           <w:p>
             <w:pPr>
@@ -5526,7 +5526,7 @@
         </w:tc>
         <w:tc>
           <w:tcPr>
-            <w:tcW w:type="dxa" w:w="4058"/>
+            <w:tcW w:type="dxa" w:w="2340"/>
           </w:tcPr>
           <w:p>
             <w:pPr>
@@ -5546,7 +5546,7 @@
       <w:tr>
         <w:tc>
           <w:tcPr>
-            <w:tcW w:type="dxa" w:w="2360"/>
+            <w:tcW w:type="dxa" w:w="2340"/>
           </w:tcPr>
           <w:p>
             <w:pPr>
@@ -5564,7 +5564,7 @@
         </w:tc>
         <w:tc>
           <w:tcPr>
-            <w:tcW w:type="dxa" w:w="1656"/>
+            <w:tcW w:type="dxa" w:w="2340"/>
           </w:tcPr>
           <w:p>
             <w:pPr>
@@ -5582,7 +5582,7 @@
         </w:tc>
         <w:tc>
           <w:tcPr>
-            <w:tcW w:type="dxa" w:w="1283"/>
+            <w:tcW w:type="dxa" w:w="2340"/>
           </w:tcPr>
           <w:p>
             <w:pPr>
@@ -5600,7 +5600,7 @@
         </w:tc>
         <w:tc>
           <w:tcPr>
-            <w:tcW w:type="dxa" w:w="4058"/>
+            <w:tcW w:type="dxa" w:w="2340"/>
           </w:tcPr>
           <w:p>
             <w:pPr>
@@ -5620,7 +5620,7 @@
       <w:tr>
         <w:tc>
           <w:tcPr>
-            <w:tcW w:type="dxa" w:w="2360"/>
+            <w:tcW w:type="dxa" w:w="2340"/>
           </w:tcPr>
           <w:p>
             <w:pPr>
@@ -5638,7 +5638,7 @@
         </w:tc>
         <w:tc>
           <w:tcPr>
-            <w:tcW w:type="dxa" w:w="1656"/>
+            <w:tcW w:type="dxa" w:w="2340"/>
           </w:tcPr>
           <w:p>
             <w:pPr>
@@ -5656,7 +5656,7 @@
         </w:tc>
         <w:tc>
           <w:tcPr>
-            <w:tcW w:type="dxa" w:w="1283"/>
+            <w:tcW w:type="dxa" w:w="2340"/>
           </w:tcPr>
           <w:p>
             <w:pPr>
@@ -5674,7 +5674,7 @@
         </w:tc>
         <w:tc>
           <w:tcPr>
-            <w:tcW w:type="dxa" w:w="4058"/>
+            <w:tcW w:type="dxa" w:w="2340"/>
           </w:tcPr>
           <w:p>
             <w:pPr>
@@ -5694,7 +5694,7 @@
       <w:tr>
         <w:tc>
           <w:tcPr>
-            <w:tcW w:type="dxa" w:w="2360"/>
+            <w:tcW w:type="dxa" w:w="2340"/>
           </w:tcPr>
           <w:p>
             <w:pPr>
@@ -5712,7 +5712,7 @@
         </w:tc>
         <w:tc>
           <w:tcPr>
-            <w:tcW w:type="dxa" w:w="1656"/>
+            <w:tcW w:type="dxa" w:w="2340"/>
           </w:tcPr>
           <w:p>
             <w:pPr>
@@ -5730,7 +5730,7 @@
         </w:tc>
         <w:tc>
           <w:tcPr>
-            <w:tcW w:type="dxa" w:w="1283"/>
+            <w:tcW w:type="dxa" w:w="2340"/>
           </w:tcPr>
           <w:p>
             <w:pPr>
@@ -5748,7 +5748,7 @@
         </w:tc>
         <w:tc>
           <w:tcPr>
-            <w:tcW w:type="dxa" w:w="4058"/>
+            <w:tcW w:type="dxa" w:w="2340"/>
           </w:tcPr>
           <w:p>
             <w:pPr>
@@ -5768,7 +5768,7 @@
       <w:tr>
         <w:tc>
           <w:tcPr>
-            <w:tcW w:type="dxa" w:w="2360"/>
+            <w:tcW w:type="dxa" w:w="2340"/>
           </w:tcPr>
           <w:p>
             <w:pPr>
@@ -5786,7 +5786,7 @@
         </w:tc>
         <w:tc>
           <w:tcPr>
-            <w:tcW w:type="dxa" w:w="1656"/>
+            <w:tcW w:type="dxa" w:w="2340"/>
           </w:tcPr>
           <w:p>
             <w:pPr>
@@ -5804,7 +5804,7 @@
         </w:tc>
         <w:tc>
           <w:tcPr>
-            <w:tcW w:type="dxa" w:w="1283"/>
+            <w:tcW w:type="dxa" w:w="2340"/>
           </w:tcPr>
           <w:p>
             <w:pPr>
@@ -5822,7 +5822,7 @@
         </w:tc>
         <w:tc>
           <w:tcPr>
-            <w:tcW w:type="dxa" w:w="4058"/>
+            <w:tcW w:type="dxa" w:w="2340"/>
           </w:tcPr>
           <w:p>
             <w:pPr>
@@ -5842,7 +5842,7 @@
       <w:tr>
         <w:tc>
           <w:tcPr>
-            <w:tcW w:type="dxa" w:w="2360"/>
+            <w:tcW w:type="dxa" w:w="2340"/>
           </w:tcPr>
           <w:p>
             <w:pPr>
@@ -5860,7 +5860,7 @@
         </w:tc>
         <w:tc>
           <w:tcPr>
-            <w:tcW w:type="dxa" w:w="1656"/>
+            <w:tcW w:type="dxa" w:w="2340"/>
           </w:tcPr>
           <w:p>
             <w:pPr>
@@ -5878,7 +5878,7 @@
         </w:tc>
         <w:tc>
           <w:tcPr>
-            <w:tcW w:type="dxa" w:w="1283"/>
+            <w:tcW w:type="dxa" w:w="2340"/>
           </w:tcPr>
           <w:p>
             <w:pPr>
@@ -5896,7 +5896,7 @@
         </w:tc>
         <w:tc>
           <w:tcPr>
-            <w:tcW w:type="dxa" w:w="4058"/>
+            <w:tcW w:type="dxa" w:w="2340"/>
           </w:tcPr>
           <w:p>
             <w:pPr>
@@ -5916,7 +5916,7 @@
       <w:tr>
         <w:tc>
           <w:tcPr>
-            <w:tcW w:type="dxa" w:w="2360"/>
+            <w:tcW w:type="dxa" w:w="2340"/>
           </w:tcPr>
           <w:p>
             <w:pPr>
@@ -5934,7 +5934,7 @@
         </w:tc>
         <w:tc>
           <w:tcPr>
-            <w:tcW w:type="dxa" w:w="1656"/>
+            <w:tcW w:type="dxa" w:w="2340"/>
           </w:tcPr>
           <w:p>
             <w:pPr>
@@ -5952,7 +5952,7 @@
         </w:tc>
         <w:tc>
           <w:tcPr>
-            <w:tcW w:type="dxa" w:w="1283"/>
+            <w:tcW w:type="dxa" w:w="2340"/>
           </w:tcPr>
           <w:p>
             <w:pPr>
@@ -5970,7 +5970,7 @@
         </w:tc>
         <w:tc>
           <w:tcPr>
-            <w:tcW w:type="dxa" w:w="4058"/>
+            <w:tcW w:type="dxa" w:w="2340"/>
           </w:tcPr>
           <w:p>
             <w:pPr>
@@ -5990,7 +5990,7 @@
       <w:tr>
         <w:tc>
           <w:tcPr>
-            <w:tcW w:type="dxa" w:w="2360"/>
+            <w:tcW w:type="dxa" w:w="2340"/>
           </w:tcPr>
           <w:p>
             <w:pPr>
@@ -6008,7 +6008,7 @@
         </w:tc>
         <w:tc>
           <w:tcPr>
-            <w:tcW w:type="dxa" w:w="1656"/>
+            <w:tcW w:type="dxa" w:w="2340"/>
           </w:tcPr>
           <w:p>
             <w:pPr>
@@ -6026,7 +6026,7 @@
         </w:tc>
         <w:tc>
           <w:tcPr>
-            <w:tcW w:type="dxa" w:w="1283"/>
+            <w:tcW w:type="dxa" w:w="2340"/>
           </w:tcPr>
           <w:p>
             <w:pPr>
@@ -6044,7 +6044,7 @@
         </w:tc>
         <w:tc>
           <w:tcPr>
-            <w:tcW w:type="dxa" w:w="4058"/>
+            <w:tcW w:type="dxa" w:w="2340"/>
           </w:tcPr>
           <w:p>
             <w:pPr>
@@ -6064,7 +6064,7 @@
       <w:tr>
         <w:tc>
           <w:tcPr>
-            <w:tcW w:type="dxa" w:w="2360"/>
+            <w:tcW w:type="dxa" w:w="2340"/>
           </w:tcPr>
           <w:p>
             <w:pPr>
@@ -6082,7 +6082,7 @@
         </w:tc>
         <w:tc>
           <w:tcPr>
-            <w:tcW w:type="dxa" w:w="1656"/>
+            <w:tcW w:type="dxa" w:w="2340"/>
           </w:tcPr>
           <w:p>
             <w:pPr>
@@ -6100,7 +6100,7 @@
         </w:tc>
         <w:tc>
           <w:tcPr>
-            <w:tcW w:type="dxa" w:w="1283"/>
+            <w:tcW w:type="dxa" w:w="2340"/>
           </w:tcPr>
           <w:p>
             <w:pPr>
@@ -6118,7 +6118,7 @@
         </w:tc>
         <w:tc>
           <w:tcPr>
-            <w:tcW w:type="dxa" w:w="4058"/>
+            <w:tcW w:type="dxa" w:w="2340"/>
           </w:tcPr>
           <w:p>
             <w:pPr>
@@ -6138,7 +6138,7 @@
       <w:tr>
         <w:tc>
           <w:tcPr>
-            <w:tcW w:type="dxa" w:w="2360"/>
+            <w:tcW w:type="dxa" w:w="2340"/>
           </w:tcPr>
           <w:p>
             <w:pPr>
@@ -6156,7 +6156,7 @@
         </w:tc>
         <w:tc>
           <w:tcPr>
-            <w:tcW w:type="dxa" w:w="1656"/>
+            <w:tcW w:type="dxa" w:w="2340"/>
           </w:tcPr>
           <w:p>
             <w:pPr>
@@ -6174,7 +6174,7 @@
         </w:tc>
         <w:tc>
           <w:tcPr>
-            <w:tcW w:type="dxa" w:w="1283"/>
+            <w:tcW w:type="dxa" w:w="2340"/>
           </w:tcPr>
           <w:p>
             <w:pPr>
@@ -6192,7 +6192,7 @@
         </w:tc>
         <w:tc>
           <w:tcPr>
-            <w:tcW w:type="dxa" w:w="4058"/>
+            <w:tcW w:type="dxa" w:w="2340"/>
           </w:tcPr>
           <w:p>
             <w:pPr>
@@ -6212,7 +6212,7 @@
       <w:tr>
         <w:tc>
           <w:tcPr>
-            <w:tcW w:type="dxa" w:w="2360"/>
+            <w:tcW w:type="dxa" w:w="2340"/>
           </w:tcPr>
           <w:p>
             <w:pPr>
@@ -6230,7 +6230,7 @@
         </w:tc>
         <w:tc>
           <w:tcPr>
-            <w:tcW w:type="dxa" w:w="1656"/>
+            <w:tcW w:type="dxa" w:w="2340"/>
           </w:tcPr>
           <w:p>
             <w:pPr>
@@ -6248,7 +6248,7 @@
         </w:tc>
         <w:tc>
           <w:tcPr>
-            <w:tcW w:type="dxa" w:w="1283"/>
+            <w:tcW w:type="dxa" w:w="2340"/>
           </w:tcPr>
           <w:p>
             <w:pPr>
@@ -6266,7 +6266,7 @@
         </w:tc>
         <w:tc>
           <w:tcPr>
-            <w:tcW w:type="dxa" w:w="4058"/>
+            <w:tcW w:type="dxa" w:w="2340"/>
           </w:tcPr>
           <w:p>
             <w:pPr>
@@ -6286,7 +6286,7 @@
       <w:tr>
         <w:tc>
           <w:tcPr>
-            <w:tcW w:type="dxa" w:w="2360"/>
+            <w:tcW w:type="dxa" w:w="2340"/>
           </w:tcPr>
           <w:p>
             <w:pPr>
@@ -6304,7 +6304,7 @@
         </w:tc>
         <w:tc>
           <w:tcPr>
-            <w:tcW w:type="dxa" w:w="1656"/>
+            <w:tcW w:type="dxa" w:w="2340"/>
           </w:tcPr>
           <w:p>
             <w:pPr>
@@ -6322,7 +6322,7 @@
         </w:tc>
         <w:tc>
           <w:tcPr>
-            <w:tcW w:type="dxa" w:w="1283"/>
+            <w:tcW w:type="dxa" w:w="2340"/>
           </w:tcPr>
           <w:p>
             <w:pPr>
@@ -6340,7 +6340,7 @@
         </w:tc>
         <w:tc>
           <w:tcPr>
-            <w:tcW w:type="dxa" w:w="4058"/>
+            <w:tcW w:type="dxa" w:w="2340"/>
           </w:tcPr>
           <w:p>
             <w:pPr>
@@ -6360,7 +6360,7 @@
       <w:tr>
         <w:tc>
           <w:tcPr>
-            <w:tcW w:type="dxa" w:w="2360"/>
+            <w:tcW w:type="dxa" w:w="2340"/>
           </w:tcPr>
           <w:p>
             <w:pPr>
@@ -6378,7 +6378,7 @@
         </w:tc>
         <w:tc>
           <w:tcPr>
-            <w:tcW w:type="dxa" w:w="1656"/>
+            <w:tcW w:type="dxa" w:w="2340"/>
           </w:tcPr>
           <w:p>
             <w:pPr>
@@ -6396,7 +6396,7 @@
         </w:tc>
         <w:tc>
           <w:tcPr>
-            <w:tcW w:type="dxa" w:w="1283"/>
+            <w:tcW w:type="dxa" w:w="2340"/>
           </w:tcPr>
           <w:p>
             <w:pPr>
@@ -6414,7 +6414,7 @@
         </w:tc>
         <w:tc>
           <w:tcPr>
-            <w:tcW w:type="dxa" w:w="4058"/>
+            <w:tcW w:type="dxa" w:w="2340"/>
           </w:tcPr>
           <w:p>
             <w:pPr>
@@ -6434,7 +6434,7 @@
       <w:tr>
         <w:tc>
           <w:tcPr>
-            <w:tcW w:type="dxa" w:w="2360"/>
+            <w:tcW w:type="dxa" w:w="2340"/>
           </w:tcPr>
           <w:p>
             <w:pPr>
@@ -6452,7 +6452,7 @@
         </w:tc>
         <w:tc>
           <w:tcPr>
-            <w:tcW w:type="dxa" w:w="1656"/>
+            <w:tcW w:type="dxa" w:w="2340"/>
           </w:tcPr>
           <w:p>
             <w:pPr>
@@ -6470,7 +6470,7 @@
         </w:tc>
         <w:tc>
           <w:tcPr>
-            <w:tcW w:type="dxa" w:w="1283"/>
+            <w:tcW w:type="dxa" w:w="2340"/>
           </w:tcPr>
           <w:p>
             <w:pPr>
@@ -6488,7 +6488,7 @@
         </w:tc>
         <w:tc>
           <w:tcPr>
-            <w:tcW w:type="dxa" w:w="4058"/>
+            <w:tcW w:type="dxa" w:w="2340"/>
           </w:tcPr>
           <w:p>
             <w:pPr>
@@ -6508,7 +6508,7 @@
       <w:tr>
         <w:tc>
           <w:tcPr>
-            <w:tcW w:type="dxa" w:w="2360"/>
+            <w:tcW w:type="dxa" w:w="2340"/>
           </w:tcPr>
           <w:p>
             <w:pPr>
@@ -6526,7 +6526,7 @@
         </w:tc>
         <w:tc>
           <w:tcPr>
-            <w:tcW w:type="dxa" w:w="1656"/>
+            <w:tcW w:type="dxa" w:w="2340"/>
           </w:tcPr>
           <w:p>
             <w:pPr>
@@ -6544,7 +6544,7 @@
         </w:tc>
         <w:tc>
           <w:tcPr>
-            <w:tcW w:type="dxa" w:w="1283"/>
+            <w:tcW w:type="dxa" w:w="2340"/>
           </w:tcPr>
           <w:p>
             <w:pPr>
@@ -6562,7 +6562,7 @@
         </w:tc>
         <w:tc>
           <w:tcPr>
-            <w:tcW w:type="dxa" w:w="4058"/>
+            <w:tcW w:type="dxa" w:w="2340"/>
           </w:tcPr>
           <w:p>
             <w:pPr>
@@ -6582,7 +6582,7 @@
       <w:tr>
         <w:tc>
           <w:tcPr>
-            <w:tcW w:type="dxa" w:w="2360"/>
+            <w:tcW w:type="dxa" w:w="2340"/>
           </w:tcPr>
           <w:p>
             <w:pPr>
@@ -6600,7 +6600,7 @@
         </w:tc>
         <w:tc>
           <w:tcPr>
-            <w:tcW w:type="dxa" w:w="1656"/>
+            <w:tcW w:type="dxa" w:w="2340"/>
           </w:tcPr>
           <w:p>
             <w:pPr>
@@ -6618,7 +6618,7 @@
         </w:tc>
         <w:tc>
           <w:tcPr>
-            <w:tcW w:type="dxa" w:w="1283"/>
+            <w:tcW w:type="dxa" w:w="2340"/>
           </w:tcPr>
           <w:p>
             <w:pPr>
@@ -6636,7 +6636,7 @@
         </w:tc>
         <w:tc>
           <w:tcPr>
-            <w:tcW w:type="dxa" w:w="4058"/>
+            <w:tcW w:type="dxa" w:w="2340"/>
           </w:tcPr>
           <w:p>
             <w:pPr>
@@ -6656,7 +6656,7 @@
       <w:tr>
         <w:tc>
           <w:tcPr>
-            <w:tcW w:type="dxa" w:w="2360"/>
+            <w:tcW w:type="dxa" w:w="2340"/>
           </w:tcPr>
           <w:p>
             <w:pPr>
@@ -6674,7 +6674,7 @@
         </w:tc>
         <w:tc>
           <w:tcPr>
-            <w:tcW w:type="dxa" w:w="1656"/>
+            <w:tcW w:type="dxa" w:w="2340"/>
           </w:tcPr>
           <w:p>
             <w:pPr>
@@ -6692,7 +6692,7 @@
         </w:tc>
         <w:tc>
           <w:tcPr>
-            <w:tcW w:type="dxa" w:w="1283"/>
+            <w:tcW w:type="dxa" w:w="2340"/>
           </w:tcPr>
           <w:p>
             <w:pPr>
@@ -6710,7 +6710,7 @@
         </w:tc>
         <w:tc>
           <w:tcPr>
-            <w:tcW w:type="dxa" w:w="4058"/>
+            <w:tcW w:type="dxa" w:w="2340"/>
           </w:tcPr>
           <w:p>
             <w:pPr>
@@ -6730,7 +6730,7 @@
       <w:tr>
         <w:tc>
           <w:tcPr>
-            <w:tcW w:type="dxa" w:w="2360"/>
+            <w:tcW w:type="dxa" w:w="2340"/>
           </w:tcPr>
           <w:p>
             <w:pPr>
@@ -6748,7 +6748,7 @@
         </w:tc>
         <w:tc>
           <w:tcPr>
-            <w:tcW w:type="dxa" w:w="1656"/>
+            <w:tcW w:type="dxa" w:w="2340"/>
           </w:tcPr>
           <w:p>
             <w:pPr>
@@ -6766,7 +6766,7 @@
         </w:tc>
         <w:tc>
           <w:tcPr>
-            <w:tcW w:type="dxa" w:w="1283"/>
+            <w:tcW w:type="dxa" w:w="2340"/>
           </w:tcPr>
           <w:p>
             <w:pPr>
@@ -6784,7 +6784,7 @@
         </w:tc>
         <w:tc>
           <w:tcPr>
-            <w:tcW w:type="dxa" w:w="4058"/>
+            <w:tcW w:type="dxa" w:w="2340"/>
           </w:tcPr>
           <w:p>
             <w:pPr>
@@ -6804,7 +6804,7 @@
       <w:tr>
         <w:tc>
           <w:tcPr>
-            <w:tcW w:type="dxa" w:w="2360"/>
+            <w:tcW w:type="dxa" w:w="2340"/>
           </w:tcPr>
           <w:p>
             <w:pPr>
@@ -6822,7 +6822,7 @@
         </w:tc>
         <w:tc>
           <w:tcPr>
-            <w:tcW w:type="dxa" w:w="1656"/>
+            <w:tcW w:type="dxa" w:w="2340"/>
           </w:tcPr>
           <w:p>
             <w:pPr>
@@ -6840,7 +6840,7 @@
         </w:tc>
         <w:tc>
           <w:tcPr>
-            <w:tcW w:type="dxa" w:w="1283"/>
+            <w:tcW w:type="dxa" w:w="2340"/>
           </w:tcPr>
           <w:p>
             <w:pPr>
@@ -6858,7 +6858,7 @@
         </w:tc>
         <w:tc>
           <w:tcPr>
-            <w:tcW w:type="dxa" w:w="4058"/>
+            <w:tcW w:type="dxa" w:w="2340"/>
           </w:tcPr>
           <w:p>
             <w:pPr>
@@ -6878,7 +6878,7 @@
       <w:tr>
         <w:tc>
           <w:tcPr>
-            <w:tcW w:type="dxa" w:w="2360"/>
+            <w:tcW w:type="dxa" w:w="2340"/>
           </w:tcPr>
           <w:p>
             <w:pPr>
@@ -6896,7 +6896,7 @@
         </w:tc>
         <w:tc>
           <w:tcPr>
-            <w:tcW w:type="dxa" w:w="1656"/>
+            <w:tcW w:type="dxa" w:w="2340"/>
           </w:tcPr>
           <w:p>
             <w:pPr>
@@ -6914,7 +6914,7 @@
         </w:tc>
         <w:tc>
           <w:tcPr>
-            <w:tcW w:type="dxa" w:w="1283"/>
+            <w:tcW w:type="dxa" w:w="2340"/>
           </w:tcPr>
           <w:p>
             <w:pPr>
@@ -6932,7 +6932,7 @@
         </w:tc>
         <w:tc>
           <w:tcPr>
-            <w:tcW w:type="dxa" w:w="4058"/>
+            <w:tcW w:type="dxa" w:w="2340"/>
           </w:tcPr>
           <w:p>
             <w:pPr>
@@ -6952,7 +6952,7 @@
       <w:tr>
         <w:tc>
           <w:tcPr>
-            <w:tcW w:type="dxa" w:w="2360"/>
+            <w:tcW w:type="dxa" w:w="2340"/>
           </w:tcPr>
           <w:p>
             <w:pPr>
@@ -6970,7 +6970,7 @@
         </w:tc>
         <w:tc>
           <w:tcPr>
-            <w:tcW w:type="dxa" w:w="1656"/>
+            <w:tcW w:type="dxa" w:w="2340"/>
           </w:tcPr>
           <w:p>
             <w:pPr>
@@ -6988,7 +6988,7 @@
         </w:tc>
         <w:tc>
           <w:tcPr>
-            <w:tcW w:type="dxa" w:w="1283"/>
+            <w:tcW w:type="dxa" w:w="2340"/>
           </w:tcPr>
           <w:p>
             <w:pPr>
@@ -7006,7 +7006,7 @@
         </w:tc>
         <w:tc>
           <w:tcPr>
-            <w:tcW w:type="dxa" w:w="4058"/>
+            <w:tcW w:type="dxa" w:w="2340"/>
           </w:tcPr>
           <w:p>
             <w:pPr>
@@ -7026,7 +7026,7 @@
       <w:tr>
         <w:tc>
           <w:tcPr>
-            <w:tcW w:type="dxa" w:w="2360"/>
+            <w:tcW w:type="dxa" w:w="2340"/>
           </w:tcPr>
           <w:p>
             <w:pPr>
@@ -7044,7 +7044,7 @@
         </w:tc>
         <w:tc>
           <w:tcPr>
-            <w:tcW w:type="dxa" w:w="1656"/>
+            <w:tcW w:type="dxa" w:w="2340"/>
           </w:tcPr>
           <w:p>
             <w:pPr>
@@ -7062,7 +7062,7 @@
         </w:tc>
         <w:tc>
           <w:tcPr>
-            <w:tcW w:type="dxa" w:w="1283"/>
+            <w:tcW w:type="dxa" w:w="2340"/>
           </w:tcPr>
           <w:p>
             <w:pPr>
@@ -7080,7 +7080,7 @@
         </w:tc>
         <w:tc>
           <w:tcPr>
-            <w:tcW w:type="dxa" w:w="4058"/>
+            <w:tcW w:type="dxa" w:w="2340"/>
           </w:tcPr>
           <w:p>
             <w:pPr>
@@ -7100,7 +7100,7 @@
       <w:tr>
         <w:tc>
           <w:tcPr>
-            <w:tcW w:type="dxa" w:w="2360"/>
+            <w:tcW w:type="dxa" w:w="2340"/>
           </w:tcPr>
           <w:p>
             <w:pPr>
@@ -7118,7 +7118,7 @@
         </w:tc>
         <w:tc>
           <w:tcPr>
-            <w:tcW w:type="dxa" w:w="1656"/>
+            <w:tcW w:type="dxa" w:w="2340"/>
           </w:tcPr>
           <w:p>
             <w:pPr>
@@ -7136,7 +7136,7 @@
         </w:tc>
         <w:tc>
           <w:tcPr>
-            <w:tcW w:type="dxa" w:w="1283"/>
+            <w:tcW w:type="dxa" w:w="2340"/>
           </w:tcPr>
           <w:p>
             <w:pPr>
@@ -7154,7 +7154,7 @@
         </w:tc>
         <w:tc>
           <w:tcPr>
-            <w:tcW w:type="dxa" w:w="4058"/>
+            <w:tcW w:type="dxa" w:w="2340"/>
           </w:tcPr>
           <w:p>
             <w:pPr>
@@ -7174,7 +7174,7 @@
       <w:tr>
         <w:tc>
           <w:tcPr>
-            <w:tcW w:type="dxa" w:w="2360"/>
+            <w:tcW w:type="dxa" w:w="2340"/>
           </w:tcPr>
           <w:p>
             <w:pPr>
@@ -7192,7 +7192,7 @@
         </w:tc>
         <w:tc>
           <w:tcPr>
-            <w:tcW w:type="dxa" w:w="1656"/>
+            <w:tcW w:type="dxa" w:w="2340"/>
           </w:tcPr>
           <w:p>
             <w:pPr>
@@ -7210,7 +7210,7 @@
         </w:tc>
         <w:tc>
           <w:tcPr>
-            <w:tcW w:type="dxa" w:w="1283"/>
+            <w:tcW w:type="dxa" w:w="2340"/>
           </w:tcPr>
           <w:p>
             <w:pPr>
@@ -7228,7 +7228,7 @@
         </w:tc>
         <w:tc>
           <w:tcPr>
-            <w:tcW w:type="dxa" w:w="4058"/>
+            <w:tcW w:type="dxa" w:w="2340"/>
           </w:tcPr>
           <w:p>
             <w:pPr>
@@ -7248,7 +7248,7 @@
       <w:tr>
         <w:tc>
           <w:tcPr>
-            <w:tcW w:type="dxa" w:w="2360"/>
+            <w:tcW w:type="dxa" w:w="2340"/>
           </w:tcPr>
           <w:p>
             <w:pPr>
@@ -7266,7 +7266,7 @@
         </w:tc>
         <w:tc>
           <w:tcPr>
-            <w:tcW w:type="dxa" w:w="1656"/>
+            <w:tcW w:type="dxa" w:w="2340"/>
           </w:tcPr>
           <w:p>
             <w:pPr>
@@ -7284,7 +7284,7 @@
         </w:tc>
         <w:tc>
           <w:tcPr>
-            <w:tcW w:type="dxa" w:w="1283"/>
+            <w:tcW w:type="dxa" w:w="2340"/>
           </w:tcPr>
           <w:p>
             <w:pPr>
@@ -7302,7 +7302,7 @@
         </w:tc>
         <w:tc>
           <w:tcPr>
-            <w:tcW w:type="dxa" w:w="4058"/>
+            <w:tcW w:type="dxa" w:w="2340"/>
           </w:tcPr>
           <w:p>
             <w:pPr>
@@ -7322,7 +7322,7 @@
       <w:tr>
         <w:tc>
           <w:tcPr>
-            <w:tcW w:type="dxa" w:w="2360"/>
+            <w:tcW w:type="dxa" w:w="2340"/>
           </w:tcPr>
           <w:p>
             <w:pPr>
@@ -7340,7 +7340,7 @@
         </w:tc>
         <w:tc>
           <w:tcPr>
-            <w:tcW w:type="dxa" w:w="1656"/>
+            <w:tcW w:type="dxa" w:w="2340"/>
           </w:tcPr>
           <w:p>
             <w:pPr>
@@ -7358,7 +7358,7 @@
         </w:tc>
         <w:tc>
           <w:tcPr>
-            <w:tcW w:type="dxa" w:w="1283"/>
+            <w:tcW w:type="dxa" w:w="2340"/>
           </w:tcPr>
           <w:p>
             <w:pPr>
@@ -7376,7 +7376,7 @@
         </w:tc>
         <w:tc>
           <w:tcPr>
-            <w:tcW w:type="dxa" w:w="4058"/>
+            <w:tcW w:type="dxa" w:w="2340"/>
           </w:tcPr>
           <w:p>
             <w:pPr>
@@ -7396,7 +7396,7 @@
       <w:tr>
         <w:tc>
           <w:tcPr>
-            <w:tcW w:type="dxa" w:w="2360"/>
+            <w:tcW w:type="dxa" w:w="2340"/>
           </w:tcPr>
           <w:p>
             <w:pPr>
@@ -7414,7 +7414,7 @@
         </w:tc>
         <w:tc>
           <w:tcPr>
-            <w:tcW w:type="dxa" w:w="1656"/>
+            <w:tcW w:type="dxa" w:w="2340"/>
           </w:tcPr>
           <w:p>
             <w:pPr>
@@ -7432,7 +7432,7 @@
         </w:tc>
         <w:tc>
           <w:tcPr>
-            <w:tcW w:type="dxa" w:w="1283"/>
+            <w:tcW w:type="dxa" w:w="2340"/>
           </w:tcPr>
           <w:p>
             <w:pPr>
@@ -7450,7 +7450,7 @@
         </w:tc>
         <w:tc>
           <w:tcPr>
-            <w:tcW w:type="dxa" w:w="4058"/>
+            <w:tcW w:type="dxa" w:w="2340"/>
           </w:tcPr>
           <w:p>
             <w:pPr>
@@ -7470,7 +7470,7 @@
       <w:tr>
         <w:tc>
           <w:tcPr>
-            <w:tcW w:type="dxa" w:w="2360"/>
+            <w:tcW w:type="dxa" w:w="2340"/>
           </w:tcPr>
           <w:p>
             <w:pPr>
@@ -7488,7 +7488,7 @@
         </w:tc>
         <w:tc>
           <w:tcPr>
-            <w:tcW w:type="dxa" w:w="1656"/>
+            <w:tcW w:type="dxa" w:w="2340"/>
           </w:tcPr>
           <w:p>
             <w:pPr>
@@ -7506,7 +7506,7 @@
         </w:tc>
         <w:tc>
           <w:tcPr>
-            <w:tcW w:type="dxa" w:w="1283"/>
+            <w:tcW w:type="dxa" w:w="2340"/>
           </w:tcPr>
           <w:p>
             <w:pPr>
@@ -7524,7 +7524,7 @@
         </w:tc>
         <w:tc>
           <w:tcPr>
-            <w:tcW w:type="dxa" w:w="4058"/>
+            <w:tcW w:type="dxa" w:w="2340"/>
           </w:tcPr>
           <w:p>
             <w:pPr>
@@ -7544,7 +7544,7 @@
       <w:tr>
         <w:tc>
           <w:tcPr>
-            <w:tcW w:type="dxa" w:w="2360"/>
+            <w:tcW w:type="dxa" w:w="2340"/>
           </w:tcPr>
           <w:p>
             <w:pPr>
@@ -7562,7 +7562,7 @@
         </w:tc>
         <w:tc>
           <w:tcPr>
-            <w:tcW w:type="dxa" w:w="1656"/>
+            <w:tcW w:type="dxa" w:w="2340"/>
           </w:tcPr>
           <w:p>
             <w:pPr>
@@ -7580,7 +7580,7 @@
         </w:tc>
         <w:tc>
           <w:tcPr>
-            <w:tcW w:type="dxa" w:w="1283"/>
+            <w:tcW w:type="dxa" w:w="2340"/>
           </w:tcPr>
           <w:p>
             <w:pPr>
@@ -7598,7 +7598,7 @@
         </w:tc>
         <w:tc>
           <w:tcPr>
-            <w:tcW w:type="dxa" w:w="4058"/>
+            <w:tcW w:type="dxa" w:w="2340"/>
           </w:tcPr>
           <w:p>
             <w:pPr>
@@ -7618,7 +7618,7 @@
       <w:tr>
         <w:tc>
           <w:tcPr>
-            <w:tcW w:type="dxa" w:w="2360"/>
+            <w:tcW w:type="dxa" w:w="2340"/>
           </w:tcPr>
           <w:p>
             <w:pPr>
@@ -7636,7 +7636,7 @@
         </w:tc>
         <w:tc>
           <w:tcPr>
-            <w:tcW w:type="dxa" w:w="1656"/>
+            <w:tcW w:type="dxa" w:w="2340"/>
           </w:tcPr>
           <w:p>
             <w:pPr>
@@ -7654,7 +7654,7 @@
         </w:tc>
         <w:tc>
           <w:tcPr>
-            <w:tcW w:type="dxa" w:w="1283"/>
+            <w:tcW w:type="dxa" w:w="2340"/>
           </w:tcPr>
           <w:p>
             <w:pPr>
@@ -7672,7 +7672,7 @@
         </w:tc>
         <w:tc>
           <w:tcPr>
-            <w:tcW w:type="dxa" w:w="4058"/>
+            <w:tcW w:type="dxa" w:w="2340"/>
           </w:tcPr>
           <w:p>
             <w:pPr>
@@ -7692,7 +7692,7 @@
       <w:tr>
         <w:tc>
           <w:tcPr>
-            <w:tcW w:type="dxa" w:w="2360"/>
+            <w:tcW w:type="dxa" w:w="2340"/>
           </w:tcPr>
           <w:p>
             <w:pPr>
@@ -7710,7 +7710,7 @@
         </w:tc>
         <w:tc>
           <w:tcPr>
-            <w:tcW w:type="dxa" w:w="1656"/>
+            <w:tcW w:type="dxa" w:w="2340"/>
           </w:tcPr>
           <w:p>
             <w:pPr>
@@ -7728,7 +7728,7 @@
         </w:tc>
         <w:tc>
           <w:tcPr>
-            <w:tcW w:type="dxa" w:w="1283"/>
+            <w:tcW w:type="dxa" w:w="2340"/>
           </w:tcPr>
           <w:p>
             <w:pPr>
@@ -7746,7 +7746,7 @@
         </w:tc>
         <w:tc>
           <w:tcPr>
-            <w:tcW w:type="dxa" w:w="4058"/>
+            <w:tcW w:type="dxa" w:w="2340"/>
           </w:tcPr>
           <w:p>
             <w:pPr>
@@ -7766,7 +7766,7 @@
       <w:tr>
         <w:tc>
           <w:tcPr>
-            <w:tcW w:type="dxa" w:w="2360"/>
+            <w:tcW w:type="dxa" w:w="2340"/>
           </w:tcPr>
           <w:p>
             <w:pPr>
@@ -7784,7 +7784,7 @@
         </w:tc>
         <w:tc>
           <w:tcPr>
-            <w:tcW w:type="dxa" w:w="1656"/>
+            <w:tcW w:type="dxa" w:w="2340"/>
           </w:tcPr>
           <w:p>
             <w:pPr>
@@ -7802,7 +7802,7 @@
         </w:tc>
         <w:tc>
           <w:tcPr>
-            <w:tcW w:type="dxa" w:w="1283"/>
+            <w:tcW w:type="dxa" w:w="2340"/>
           </w:tcPr>
           <w:p>
             <w:pPr>
@@ -7820,7 +7820,7 @@
         </w:tc>
         <w:tc>
           <w:tcPr>
-            <w:tcW w:type="dxa" w:w="4058"/>
+            <w:tcW w:type="dxa" w:w="2340"/>
           </w:tcPr>
           <w:p>
             <w:pPr>
@@ -7840,7 +7840,7 @@
       <w:tr>
         <w:tc>
           <w:tcPr>
-            <w:tcW w:type="dxa" w:w="2360"/>
+            <w:tcW w:type="dxa" w:w="2340"/>
           </w:tcPr>
           <w:p>
             <w:pPr>
@@ -7858,7 +7858,7 @@
         </w:tc>
         <w:tc>
           <w:tcPr>
-            <w:tcW w:type="dxa" w:w="1656"/>
+            <w:tcW w:type="dxa" w:w="2340"/>
           </w:tcPr>
           <w:p>
             <w:pPr>
@@ -7876,7 +7876,7 @@
         </w:tc>
         <w:tc>
           <w:tcPr>
-            <w:tcW w:type="dxa" w:w="1283"/>
+            <w:tcW w:type="dxa" w:w="2340"/>
           </w:tcPr>
           <w:p>
             <w:pPr>
@@ -7894,7 +7894,7 @@
         </w:tc>
         <w:tc>
           <w:tcPr>
-            <w:tcW w:type="dxa" w:w="4058"/>
+            <w:tcW w:type="dxa" w:w="2340"/>
           </w:tcPr>
           <w:p>
             <w:pPr>
@@ -7914,7 +7914,7 @@
       <w:tr>
         <w:tc>
           <w:tcPr>
-            <w:tcW w:type="dxa" w:w="2360"/>
+            <w:tcW w:type="dxa" w:w="2340"/>
           </w:tcPr>
           <w:p>
             <w:pPr>
@@ -7932,7 +7932,7 @@
         </w:tc>
         <w:tc>
           <w:tcPr>
-            <w:tcW w:type="dxa" w:w="1656"/>
+            <w:tcW w:type="dxa" w:w="2340"/>
           </w:tcPr>
           <w:p>
             <w:pPr>
@@ -7950,7 +7950,7 @@
         </w:tc>
         <w:tc>
           <w:tcPr>
-            <w:tcW w:type="dxa" w:w="1283"/>
+            <w:tcW w:type="dxa" w:w="2340"/>
           </w:tcPr>
           <w:p>
             <w:pPr>
@@ -7968,7 +7968,7 @@
         </w:tc>
         <w:tc>
           <w:tcPr>
-            <w:tcW w:type="dxa" w:w="4058"/>
+            <w:tcW w:type="dxa" w:w="2340"/>
           </w:tcPr>
           <w:p>
             <w:pPr>
@@ -7988,7 +7988,7 @@
       <w:tr>
         <w:tc>
           <w:tcPr>
-            <w:tcW w:type="dxa" w:w="2360"/>
+            <w:tcW w:type="dxa" w:w="2340"/>
           </w:tcPr>
           <w:p>
             <w:pPr>
@@ -8006,7 +8006,7 @@
         </w:tc>
         <w:tc>
           <w:tcPr>
-            <w:tcW w:type="dxa" w:w="1656"/>
+            <w:tcW w:type="dxa" w:w="2340"/>
           </w:tcPr>
           <w:p>
             <w:pPr>
@@ -8024,7 +8024,7 @@
         </w:tc>
         <w:tc>
           <w:tcPr>
-            <w:tcW w:type="dxa" w:w="1283"/>
+            <w:tcW w:type="dxa" w:w="2340"/>
           </w:tcPr>
           <w:p>
             <w:pPr>
@@ -8042,7 +8042,7 @@
         </w:tc>
         <w:tc>
           <w:tcPr>
-            <w:tcW w:type="dxa" w:w="4058"/>
+            <w:tcW w:type="dxa" w:w="2340"/>
           </w:tcPr>
           <w:p>
             <w:pPr>
@@ -8062,7 +8062,7 @@
       <w:tr>
         <w:tc>
           <w:tcPr>
-            <w:tcW w:type="dxa" w:w="2360"/>
+            <w:tcW w:type="dxa" w:w="2340"/>
           </w:tcPr>
           <w:p>
             <w:pPr>
@@ -8080,7 +8080,7 @@
         </w:tc>
         <w:tc>
           <w:tcPr>
-            <w:tcW w:type="dxa" w:w="1656"/>
+            <w:tcW w:type="dxa" w:w="2340"/>
           </w:tcPr>
           <w:p>
             <w:pPr>
@@ -8098,7 +8098,7 @@
         </w:tc>
         <w:tc>
           <w:tcPr>
-            <w:tcW w:type="dxa" w:w="1283"/>
+            <w:tcW w:type="dxa" w:w="2340"/>
           </w:tcPr>
           <w:p>
             <w:pPr>
@@ -8116,7 +8116,7 @@
         </w:tc>
         <w:tc>
           <w:tcPr>
-            <w:tcW w:type="dxa" w:w="4058"/>
+            <w:tcW w:type="dxa" w:w="2340"/>
           </w:tcPr>
           <w:p>
             <w:pPr>
@@ -8136,7 +8136,7 @@
       <w:tr>
         <w:tc>
           <w:tcPr>
-            <w:tcW w:type="dxa" w:w="2360"/>
+            <w:tcW w:type="dxa" w:w="2340"/>
           </w:tcPr>
           <w:p>
             <w:pPr>
@@ -8154,7 +8154,7 @@
         </w:tc>
         <w:tc>
           <w:tcPr>
-            <w:tcW w:type="dxa" w:w="1656"/>
+            <w:tcW w:type="dxa" w:w="2340"/>
           </w:tcPr>
           <w:p>
             <w:pPr>
@@ -8172,7 +8172,7 @@
         </w:tc>
         <w:tc>
           <w:tcPr>
-            <w:tcW w:type="dxa" w:w="1283"/>
+            <w:tcW w:type="dxa" w:w="2340"/>
           </w:tcPr>
           <w:p>
             <w:pPr>
@@ -8190,7 +8190,7 @@
         </w:tc>
         <w:tc>
           <w:tcPr>
-            <w:tcW w:type="dxa" w:w="4058"/>
+            <w:tcW w:type="dxa" w:w="2340"/>
           </w:tcPr>
           <w:p>
             <w:pPr>
@@ -8210,7 +8210,7 @@
       <w:tr>
         <w:tc>
           <w:tcPr>
-            <w:tcW w:type="dxa" w:w="2360"/>
+            <w:tcW w:type="dxa" w:w="2340"/>
           </w:tcPr>
           <w:p>
             <w:pPr>
@@ -8228,7 +8228,7 @@
         </w:tc>
         <w:tc>
           <w:tcPr>
-            <w:tcW w:type="dxa" w:w="1656"/>
+            <w:tcW w:type="dxa" w:w="2340"/>
           </w:tcPr>
           <w:p>
             <w:pPr>
@@ -8246,7 +8246,7 @@
         </w:tc>
         <w:tc>
           <w:tcPr>
-            <w:tcW w:type="dxa" w:w="1283"/>
+            <w:tcW w:type="dxa" w:w="2340"/>
           </w:tcPr>
           <w:p>
             <w:pPr>
@@ -8264,7 +8264,7 @@
         </w:tc>
         <w:tc>
           <w:tcPr>
-            <w:tcW w:type="dxa" w:w="4058"/>
+            <w:tcW w:type="dxa" w:w="2340"/>
           </w:tcPr>
           <w:p>
             <w:pPr>
@@ -8284,7 +8284,7 @@
       <w:tr>
         <w:tc>
           <w:tcPr>
-            <w:tcW w:type="dxa" w:w="2360"/>
+            <w:tcW w:type="dxa" w:w="2340"/>
           </w:tcPr>
           <w:p>
             <w:pPr>
@@ -8302,7 +8302,7 @@
         </w:tc>
         <w:tc>
           <w:tcPr>
-            <w:tcW w:type="dxa" w:w="1656"/>
+            <w:tcW w:type="dxa" w:w="2340"/>
           </w:tcPr>
           <w:p>
             <w:pPr>
@@ -8320,7 +8320,7 @@
         </w:tc>
         <w:tc>
           <w:tcPr>
-            <w:tcW w:type="dxa" w:w="1283"/>
+            <w:tcW w:type="dxa" w:w="2340"/>
           </w:tcPr>
           <w:p>
             <w:pPr>
@@ -8338,7 +8338,7 @@
         </w:tc>
         <w:tc>
           <w:tcPr>
-            <w:tcW w:type="dxa" w:w="4058"/>
+            <w:tcW w:type="dxa" w:w="2340"/>
           </w:tcPr>
           <w:p>
             <w:pPr>
@@ -8358,7 +8358,7 @@
       <w:tr>
         <w:tc>
           <w:tcPr>
-            <w:tcW w:type="dxa" w:w="2360"/>
+            <w:tcW w:type="dxa" w:w="2340"/>
           </w:tcPr>
           <w:p>
             <w:pPr>
@@ -8376,7 +8376,7 @@
         </w:tc>
         <w:tc>
           <w:tcPr>
-            <w:tcW w:type="dxa" w:w="1656"/>
+            <w:tcW w:type="dxa" w:w="2340"/>
           </w:tcPr>
           <w:p>
             <w:pPr>
@@ -8394,7 +8394,7 @@
         </w:tc>
         <w:tc>
           <w:tcPr>
-            <w:tcW w:type="dxa" w:w="1283"/>
+            <w:tcW w:type="dxa" w:w="2340"/>
           </w:tcPr>
           <w:p>
             <w:pPr>
@@ -8412,7 +8412,7 @@
         </w:tc>
         <w:tc>
           <w:tcPr>
-            <w:tcW w:type="dxa" w:w="4058"/>
+            <w:tcW w:type="dxa" w:w="2340"/>
           </w:tcPr>
           <w:p>
             <w:pPr>
@@ -8432,7 +8432,7 @@
       <w:tr>
         <w:tc>
           <w:tcPr>
-            <w:tcW w:type="dxa" w:w="2360"/>
+            <w:tcW w:type="dxa" w:w="2340"/>
           </w:tcPr>
           <w:p>
             <w:pPr>
@@ -8450,7 +8450,7 @@
         </w:tc>
         <w:tc>
           <w:tcPr>
-            <w:tcW w:type="dxa" w:w="1656"/>
+            <w:tcW w:type="dxa" w:w="2340"/>
           </w:tcPr>
           <w:p>
             <w:pPr>
@@ -8468,7 +8468,7 @@
         </w:tc>
         <w:tc>
           <w:tcPr>
-            <w:tcW w:type="dxa" w:w="1283"/>
+            <w:tcW w:type="dxa" w:w="2340"/>
           </w:tcPr>
           <w:p>
             <w:pPr>
@@ -8486,7 +8486,7 @@
         </w:tc>
         <w:tc>
           <w:tcPr>
-            <w:tcW w:type="dxa" w:w="4058"/>
+            <w:tcW w:type="dxa" w:w="2340"/>
           </w:tcPr>
           <w:p>
             <w:pPr>
@@ -8506,7 +8506,7 @@
       <w:tr>
         <w:tc>
           <w:tcPr>
-            <w:tcW w:type="dxa" w:w="2360"/>
+            <w:tcW w:type="dxa" w:w="2340"/>
           </w:tcPr>
           <w:p>
             <w:pPr>
@@ -8524,7 +8524,7 @@
         </w:tc>
         <w:tc>
           <w:tcPr>
-            <w:tcW w:type="dxa" w:w="1656"/>
+            <w:tcW w:type="dxa" w:w="2340"/>
           </w:tcPr>
           <w:p>
             <w:pPr>
@@ -8542,7 +8542,7 @@
         </w:tc>
         <w:tc>
           <w:tcPr>
-            <w:tcW w:type="dxa" w:w="1283"/>
+            <w:tcW w:type="dxa" w:w="2340"/>
           </w:tcPr>
           <w:p>
             <w:pPr>
@@ -8560,7 +8560,7 @@
         </w:tc>
         <w:tc>
           <w:tcPr>
-            <w:tcW w:type="dxa" w:w="4058"/>
+            <w:tcW w:type="dxa" w:w="2340"/>
           </w:tcPr>
           <w:p>
             <w:pPr>
@@ -8580,7 +8580,7 @@
       <w:tr>
         <w:tc>
           <w:tcPr>
-            <w:tcW w:type="dxa" w:w="2360"/>
+            <w:tcW w:type="dxa" w:w="2340"/>
           </w:tcPr>
           <w:p>
             <w:pPr>
@@ -8598,7 +8598,7 @@
         </w:tc>
         <w:tc>
           <w:tcPr>
-            <w:tcW w:type="dxa" w:w="1656"/>
+            <w:tcW w:type="dxa" w:w="2340"/>
           </w:tcPr>
           <w:p>
             <w:pPr>
@@ -8616,7 +8616,7 @@
         </w:tc>
         <w:tc>
           <w:tcPr>
-            <w:tcW w:type="dxa" w:w="1283"/>
+            <w:tcW w:type="dxa" w:w="2340"/>
           </w:tcPr>
           <w:p>
             <w:pPr>
@@ -8634,7 +8634,7 @@
         </w:tc>
         <w:tc>
           <w:tcPr>
-            <w:tcW w:type="dxa" w:w="4058"/>
+            <w:tcW w:type="dxa" w:w="2340"/>
           </w:tcPr>
           <w:p>
             <w:pPr>
@@ -8654,7 +8654,7 @@
       <w:tr>
         <w:tc>
           <w:tcPr>
-            <w:tcW w:type="dxa" w:w="2360"/>
+            <w:tcW w:type="dxa" w:w="2340"/>
           </w:tcPr>
           <w:p>
             <w:pPr>
@@ -8672,7 +8672,7 @@
         </w:tc>
         <w:tc>
           <w:tcPr>
-            <w:tcW w:type="dxa" w:w="1656"/>
+            <w:tcW w:type="dxa" w:w="2340"/>
           </w:tcPr>
           <w:p>
             <w:pPr>
@@ -8690,7 +8690,7 @@
         </w:tc>
         <w:tc>
           <w:tcPr>
-            <w:tcW w:type="dxa" w:w="1283"/>
+            <w:tcW w:type="dxa" w:w="2340"/>
           </w:tcPr>
           <w:p>
             <w:pPr>
@@ -8708,7 +8708,7 @@
         </w:tc>
         <w:tc>
           <w:tcPr>
-            <w:tcW w:type="dxa" w:w="4058"/>
+            <w:tcW w:type="dxa" w:w="2340"/>
           </w:tcPr>
           <w:p>
             <w:pPr>
@@ -8728,7 +8728,7 @@
       <w:tr>
         <w:tc>
           <w:tcPr>
-            <w:tcW w:type="dxa" w:w="2360"/>
+            <w:tcW w:type="dxa" w:w="2340"/>
           </w:tcPr>
           <w:p>
             <w:pPr>
@@ -8746,7 +8746,7 @@
         </w:tc>
         <w:tc>
           <w:tcPr>
-            <w:tcW w:type="dxa" w:w="1656"/>
+            <w:tcW w:type="dxa" w:w="2340"/>
           </w:tcPr>
           <w:p>
             <w:pPr>
@@ -8764,7 +8764,7 @@
         </w:tc>
         <w:tc>
           <w:tcPr>
-            <w:tcW w:type="dxa" w:w="1283"/>
+            <w:tcW w:type="dxa" w:w="2340"/>
           </w:tcPr>
           <w:p>
             <w:pPr>
@@ -8782,7 +8782,7 @@
         </w:tc>
         <w:tc>
           <w:tcPr>
-            <w:tcW w:type="dxa" w:w="4058"/>
+            <w:tcW w:type="dxa" w:w="2340"/>
           </w:tcPr>
           <w:p>
             <w:pPr>
@@ -8802,7 +8802,7 @@
       <w:tr>
         <w:tc>
           <w:tcPr>
-            <w:tcW w:type="dxa" w:w="2360"/>
+            <w:tcW w:type="dxa" w:w="2340"/>
           </w:tcPr>
           <w:p>
             <w:pPr>
@@ -8820,7 +8820,7 @@
         </w:tc>
         <w:tc>
           <w:tcPr>
-            <w:tcW w:type="dxa" w:w="1656"/>
+            <w:tcW w:type="dxa" w:w="2340"/>
           </w:tcPr>
           <w:p>
             <w:pPr>
@@ -8838,7 +8838,7 @@
         </w:tc>
         <w:tc>
           <w:tcPr>
-            <w:tcW w:type="dxa" w:w="1283"/>
+            <w:tcW w:type="dxa" w:w="2340"/>
           </w:tcPr>
           <w:p>
             <w:pPr>
@@ -8856,7 +8856,7 @@
         </w:tc>
         <w:tc>
           <w:tcPr>
-            <w:tcW w:type="dxa" w:w="4058"/>
+            <w:tcW w:type="dxa" w:w="2340"/>
           </w:tcPr>
           <w:p>
             <w:pPr>
@@ -8876,7 +8876,7 @@
       <w:tr>
         <w:tc>
           <w:tcPr>
-            <w:tcW w:type="dxa" w:w="2360"/>
+            <w:tcW w:type="dxa" w:w="2340"/>
           </w:tcPr>
           <w:p>
             <w:pPr>
@@ -8894,7 +8894,7 @@
         </w:tc>
         <w:tc>
           <w:tcPr>
-            <w:tcW w:type="dxa" w:w="1656"/>
+            <w:tcW w:type="dxa" w:w="2340"/>
           </w:tcPr>
           <w:p>
             <w:pPr>
@@ -8912,7 +8912,7 @@
         </w:tc>
         <w:tc>
           <w:tcPr>
-            <w:tcW w:type="dxa" w:w="1283"/>
+            <w:tcW w:type="dxa" w:w="2340"/>
           </w:tcPr>
           <w:p>
             <w:pPr>
@@ -8930,7 +8930,7 @@
         </w:tc>
         <w:tc>
           <w:tcPr>
-            <w:tcW w:type="dxa" w:w="4058"/>
+            <w:tcW w:type="dxa" w:w="2340"/>
           </w:tcPr>
           <w:p>
             <w:pPr>
@@ -8950,7 +8950,7 @@
       <w:tr>
         <w:tc>
           <w:tcPr>
-            <w:tcW w:type="dxa" w:w="2360"/>
+            <w:tcW w:type="dxa" w:w="2340"/>
           </w:tcPr>
           <w:p>
             <w:pPr>
@@ -8968,7 +8968,7 @@
         </w:tc>
         <w:tc>
           <w:tcPr>
-            <w:tcW w:type="dxa" w:w="1656"/>
+            <w:tcW w:type="dxa" w:w="2340"/>
           </w:tcPr>
           <w:p>
             <w:pPr>
@@ -8986,7 +8986,7 @@
         </w:tc>
         <w:tc>
           <w:tcPr>
-            <w:tcW w:type="dxa" w:w="1283"/>
+            <w:tcW w:type="dxa" w:w="2340"/>
           </w:tcPr>
           <w:p>
             <w:pPr>
@@ -9004,7 +9004,7 @@
         </w:tc>
         <w:tc>
           <w:tcPr>
-            <w:tcW w:type="dxa" w:w="4058"/>
+            <w:tcW w:type="dxa" w:w="2340"/>
           </w:tcPr>
           <w:p>
             <w:pPr>
@@ -9024,7 +9024,7 @@
       <w:tr>
         <w:tc>
           <w:tcPr>
-            <w:tcW w:type="dxa" w:w="2360"/>
+            <w:tcW w:type="dxa" w:w="2340"/>
           </w:tcPr>
           <w:p>
             <w:pPr>
@@ -9042,7 +9042,7 @@
         </w:tc>
         <w:tc>
           <w:tcPr>
-            <w:tcW w:type="dxa" w:w="1656"/>
+            <w:tcW w:type="dxa" w:w="2340"/>
           </w:tcPr>
           <w:p>
             <w:pPr>
@@ -9060,7 +9060,7 @@
         </w:tc>
         <w:tc>
           <w:tcPr>
-            <w:tcW w:type="dxa" w:w="1283"/>
+            <w:tcW w:type="dxa" w:w="2340"/>
           </w:tcPr>
           <w:p>
             <w:pPr>
@@ -9078,7 +9078,7 @@
         </w:tc>
         <w:tc>
           <w:tcPr>
-            <w:tcW w:type="dxa" w:w="4058"/>
+            <w:tcW w:type="dxa" w:w="2340"/>
           </w:tcPr>
           <w:p>
             <w:pPr>
@@ -9098,7 +9098,7 @@
       <w:tr>
         <w:tc>
           <w:tcPr>
-            <w:tcW w:type="dxa" w:w="2360"/>
+            <w:tcW w:type="dxa" w:w="2340"/>
           </w:tcPr>
           <w:p>
             <w:pPr>
@@ -9116,7 +9116,7 @@
         </w:tc>
         <w:tc>
           <w:tcPr>
-            <w:tcW w:type="dxa" w:w="1656"/>
+            <w:tcW w:type="dxa" w:w="2340"/>
           </w:tcPr>
           <w:p>
             <w:pPr>
@@ -9134,7 +9134,7 @@
         </w:tc>
         <w:tc>
           <w:tcPr>
-            <w:tcW w:type="dxa" w:w="1283"/>
+            <w:tcW w:type="dxa" w:w="2340"/>
           </w:tcPr>
           <w:p>
             <w:pPr>
@@ -9152,7 +9152,7 @@
         </w:tc>
         <w:tc>
           <w:tcPr>
-            <w:tcW w:type="dxa" w:w="4058"/>
+            <w:tcW w:type="dxa" w:w="2340"/>
           </w:tcPr>
           <w:p>
             <w:pPr>
@@ -9172,7 +9172,7 @@
       <w:tr>
         <w:tc>
           <w:tcPr>
-            <w:tcW w:type="dxa" w:w="2360"/>
+            <w:tcW w:type="dxa" w:w="2340"/>
           </w:tcPr>
           <w:p>
             <w:pPr>
@@ -9190,7 +9190,7 @@
         </w:tc>
         <w:tc>
           <w:tcPr>
-            <w:tcW w:type="dxa" w:w="1656"/>
+            <w:tcW w:type="dxa" w:w="2340"/>
           </w:tcPr>
           <w:p>
             <w:pPr>
@@ -9208,7 +9208,7 @@
         </w:tc>
         <w:tc>
           <w:tcPr>
-            <w:tcW w:type="dxa" w:w="1283"/>
+            <w:tcW w:type="dxa" w:w="2340"/>
           </w:tcPr>
           <w:p>
             <w:pPr>
@@ -9226,7 +9226,7 @@
         </w:tc>
         <w:tc>
           <w:tcPr>
-            <w:tcW w:type="dxa" w:w="4058"/>
+            <w:tcW w:type="dxa" w:w="2340"/>
           </w:tcPr>
           <w:p>
             <w:pPr>
@@ -9246,7 +9246,7 @@
       <w:tr>
         <w:tc>
           <w:tcPr>
-            <w:tcW w:type="dxa" w:w="2360"/>
+            <w:tcW w:type="dxa" w:w="2340"/>
           </w:tcPr>
           <w:p>
             <w:pPr>
@@ -9264,7 +9264,7 @@
         </w:tc>
         <w:tc>
           <w:tcPr>
-            <w:tcW w:type="dxa" w:w="1656"/>
+            <w:tcW w:type="dxa" w:w="2340"/>
           </w:tcPr>
           <w:p>
             <w:pPr>
@@ -9282,7 +9282,7 @@
         </w:tc>
         <w:tc>
           <w:tcPr>
-            <w:tcW w:type="dxa" w:w="1283"/>
+            <w:tcW w:type="dxa" w:w="2340"/>
           </w:tcPr>
           <w:p>
             <w:pPr>
@@ -9300,7 +9300,7 @@
         </w:tc>
         <w:tc>
           <w:tcPr>
-            <w:tcW w:type="dxa" w:w="4058"/>
+            <w:tcW w:type="dxa" w:w="2340"/>
           </w:tcPr>
           <w:p>
             <w:pPr>

</xml_diff>